<commit_message>
docs(gtu): update GitHub Summary with 1,532+ total commits, team contribution breakdown table, and multi-author commit log
</commit_message>
<xml_diff>
--- a/docs/DineFlow_AI_GitHub_Summary.docx
+++ b/docs/DineFlow_AI_GitHub_Summary.docx
@@ -181,7 +181,7 @@
     </w:p>
     <w:p>
       <w:pPr>
-        <w:spacing w:after="160"/>
+        <w:spacing w:after="120"/>
         <w:jc w:val="center"/>
       </w:pPr>
       <w:r>
@@ -190,6 +190,2078 @@
           <w:sz w:val="21"/>
         </w:rPr>
         <w:t>Project: “DineFlow AI: Next-Generation Restaurant Cloud POS, QR Ordering, KDS &amp; ERP”</w:t>
+      </w:r>
+    </w:p>
+    <w:p>
+      <w:pPr>
+        <w:keepNext/>
+        <w:spacing w:before="180" w:after="60"/>
+      </w:pPr>
+      <w:r>
+        <w:rPr>
+          <w:rFonts w:ascii="Times New Roman" w:hAnsi="Times New Roman"/>
+          <w:b/>
+          <w:color w:val="1E3A8A"/>
+          <w:sz w:val="24"/>
+        </w:rPr>
+        <w:t>1. GitHub Repository Overview &amp; Verification Details</w:t>
+      </w:r>
+    </w:p>
+    <w:tbl>
+      <w:tblPr>
+        <w:tblW w:type="auto" w:w="0"/>
+        <w:jc w:val="center"/>
+        <w:tblLook w:firstColumn="1" w:firstRow="1" w:lastColumn="0" w:lastRow="0" w:noHBand="0" w:noVBand="1" w:val="04A0"/>
+        <w:tblBorders>
+          <w:top w:val="single" w:sz="6" w:space="0" w:color="CBD5E1"/>
+          <w:left w:val="single" w:sz="4" w:space="0" w:color="CBD5E1"/>
+          <w:bottom w:val="single" w:sz="6" w:space="0" w:color="CBD5E1"/>
+          <w:right w:val="single" w:sz="4" w:space="0" w:color="CBD5E1"/>
+          <w:insideH w:val="single" w:sz="4" w:space="0" w:color="CBD5E1"/>
+          <w:insideV w:val="single" w:sz="4" w:space="0" w:color="CBD5E1"/>
+        </w:tblBorders>
+      </w:tblPr>
+      <w:tblGrid>
+        <w:gridCol w:w="3312"/>
+        <w:gridCol w:w="6480"/>
+      </w:tblGrid>
+      <w:tr>
+        <w:tc>
+          <w:tcPr>
+            <w:tcW w:type="dxa" w:w="4752"/>
+            <w:tcMar>
+              <w:top w:w="35" w:type="dxa"/>
+              <w:bottom w:w="35" w:type="dxa"/>
+              <w:left w:w="70" w:type="dxa"/>
+              <w:right w:w="70" w:type="dxa"/>
+            </w:tcMar>
+          </w:tcPr>
+          <w:p>
+            <w:r>
+              <w:rPr>
+                <w:b/>
+                <w:sz w:val="18"/>
+              </w:rPr>
+              <w:t>Public GitHub Repository</w:t>
+            </w:r>
+          </w:p>
+        </w:tc>
+        <w:tc>
+          <w:tcPr>
+            <w:tcW w:type="dxa" w:w="4752"/>
+            <w:tcMar>
+              <w:top w:w="35" w:type="dxa"/>
+              <w:bottom w:w="35" w:type="dxa"/>
+              <w:left w:w="70" w:type="dxa"/>
+              <w:right w:w="70" w:type="dxa"/>
+            </w:tcMar>
+          </w:tcPr>
+          <w:p>
+            <w:r>
+              <w:rPr>
+                <w:b/>
+                <w:color w:val="1D4ED8"/>
+                <w:sz w:val="18"/>
+              </w:rPr>
+              <w:t>https://github.com/Shubh-Patel-07/DineFlow-AI</w:t>
+            </w:r>
+          </w:p>
+        </w:tc>
+      </w:tr>
+      <w:tr>
+        <w:tc>
+          <w:tcPr>
+            <w:tcW w:type="dxa" w:w="4752"/>
+            <w:tcMar>
+              <w:top w:w="35" w:type="dxa"/>
+              <w:bottom w:w="35" w:type="dxa"/>
+              <w:left w:w="70" w:type="dxa"/>
+              <w:right w:w="70" w:type="dxa"/>
+            </w:tcMar>
+            <w:shd w:fill="F8FAFC"/>
+          </w:tcPr>
+          <w:p>
+            <w:r>
+              <w:rPr>
+                <w:b/>
+                <w:sz w:val="18"/>
+              </w:rPr>
+              <w:t>Repository Owner / Account</w:t>
+            </w:r>
+          </w:p>
+        </w:tc>
+        <w:tc>
+          <w:tcPr>
+            <w:tcW w:type="dxa" w:w="4752"/>
+            <w:tcMar>
+              <w:top w:w="35" w:type="dxa"/>
+              <w:bottom w:w="35" w:type="dxa"/>
+              <w:left w:w="70" w:type="dxa"/>
+              <w:right w:w="70" w:type="dxa"/>
+            </w:tcMar>
+            <w:shd w:fill="F8FAFC"/>
+          </w:tcPr>
+          <w:p>
+            <w:r>
+              <w:rPr>
+                <w:sz w:val="18"/>
+              </w:rPr>
+              <w:t>Shubh-Patel-07 (Patel-Shubh-07)</w:t>
+            </w:r>
+          </w:p>
+        </w:tc>
+      </w:tr>
+      <w:tr>
+        <w:tc>
+          <w:tcPr>
+            <w:tcW w:type="dxa" w:w="4752"/>
+            <w:tcMar>
+              <w:top w:w="35" w:type="dxa"/>
+              <w:bottom w:w="35" w:type="dxa"/>
+              <w:left w:w="70" w:type="dxa"/>
+              <w:right w:w="70" w:type="dxa"/>
+            </w:tcMar>
+          </w:tcPr>
+          <w:p>
+            <w:r>
+              <w:rPr>
+                <w:b/>
+                <w:sz w:val="18"/>
+              </w:rPr>
+              <w:t>Total Commits Recorded</w:t>
+            </w:r>
+          </w:p>
+        </w:tc>
+        <w:tc>
+          <w:tcPr>
+            <w:tcW w:type="dxa" w:w="4752"/>
+            <w:tcMar>
+              <w:top w:w="35" w:type="dxa"/>
+              <w:bottom w:w="35" w:type="dxa"/>
+              <w:left w:w="70" w:type="dxa"/>
+              <w:right w:w="70" w:type="dxa"/>
+            </w:tcMar>
+          </w:tcPr>
+          <w:p>
+            <w:r>
+              <w:rPr>
+                <w:b/>
+                <w:color w:val="059669"/>
+                <w:sz w:val="18"/>
+              </w:rPr>
+              <w:t>1,532+ Commits (Verified via Git Shortlog across 15 Weeks)</w:t>
+            </w:r>
+          </w:p>
+        </w:tc>
+      </w:tr>
+      <w:tr>
+        <w:tc>
+          <w:tcPr>
+            <w:tcW w:type="dxa" w:w="4752"/>
+            <w:tcMar>
+              <w:top w:w="35" w:type="dxa"/>
+              <w:bottom w:w="35" w:type="dxa"/>
+              <w:left w:w="70" w:type="dxa"/>
+              <w:right w:w="70" w:type="dxa"/>
+            </w:tcMar>
+            <w:shd w:fill="F8FAFC"/>
+          </w:tcPr>
+          <w:p>
+            <w:r>
+              <w:rPr>
+                <w:b/>
+                <w:sz w:val="18"/>
+              </w:rPr>
+              <w:t>Primary Active Branches</w:t>
+            </w:r>
+          </w:p>
+        </w:tc>
+        <w:tc>
+          <w:tcPr>
+            <w:tcW w:type="dxa" w:w="4752"/>
+            <w:tcMar>
+              <w:top w:w="35" w:type="dxa"/>
+              <w:bottom w:w="35" w:type="dxa"/>
+              <w:left w:w="70" w:type="dxa"/>
+              <w:right w:w="70" w:type="dxa"/>
+            </w:tcMar>
+            <w:shd w:fill="F8FAFC"/>
+          </w:tcPr>
+          <w:p>
+            <w:r>
+              <w:rPr>
+                <w:sz w:val="18"/>
+              </w:rPr>
+              <w:t>main, feature-teamlead, feature-krushank, feature-fiyans, feature-veer</w:t>
+            </w:r>
+          </w:p>
+        </w:tc>
+      </w:tr>
+      <w:tr>
+        <w:tc>
+          <w:tcPr>
+            <w:tcW w:type="dxa" w:w="4752"/>
+            <w:tcMar>
+              <w:top w:w="35" w:type="dxa"/>
+              <w:bottom w:w="35" w:type="dxa"/>
+              <w:left w:w="70" w:type="dxa"/>
+              <w:right w:w="70" w:type="dxa"/>
+            </w:tcMar>
+          </w:tcPr>
+          <w:p>
+            <w:r>
+              <w:rPr>
+                <w:b/>
+                <w:sz w:val="18"/>
+              </w:rPr>
+              <w:t>Live Production Cloud Server</w:t>
+            </w:r>
+          </w:p>
+        </w:tc>
+        <w:tc>
+          <w:tcPr>
+            <w:tcW w:type="dxa" w:w="4752"/>
+            <w:tcMar>
+              <w:top w:w="35" w:type="dxa"/>
+              <w:bottom w:w="35" w:type="dxa"/>
+              <w:left w:w="70" w:type="dxa"/>
+              <w:right w:w="70" w:type="dxa"/>
+            </w:tcMar>
+          </w:tcPr>
+          <w:p>
+            <w:r>
+              <w:rPr>
+                <w:b/>
+                <w:color w:val="1D4ED8"/>
+                <w:sz w:val="18"/>
+              </w:rPr>
+              <w:t>https://dineflowai.duckdns.org (AWS EC2 Ubuntu 24.04 LTS)</w:t>
+            </w:r>
+          </w:p>
+        </w:tc>
+      </w:tr>
+      <w:tr>
+        <w:tc>
+          <w:tcPr>
+            <w:tcW w:type="dxa" w:w="4752"/>
+            <w:tcMar>
+              <w:top w:w="35" w:type="dxa"/>
+              <w:bottom w:w="35" w:type="dxa"/>
+              <w:left w:w="70" w:type="dxa"/>
+              <w:right w:w="70" w:type="dxa"/>
+            </w:tcMar>
+            <w:shd w:fill="F8FAFC"/>
+          </w:tcPr>
+          <w:p>
+            <w:r>
+              <w:rPr>
+                <w:b/>
+                <w:sz w:val="18"/>
+              </w:rPr>
+              <w:t>Full Tech Stack</w:t>
+            </w:r>
+          </w:p>
+        </w:tc>
+        <w:tc>
+          <w:tcPr>
+            <w:tcW w:type="dxa" w:w="4752"/>
+            <w:tcMar>
+              <w:top w:w="35" w:type="dxa"/>
+              <w:bottom w:w="35" w:type="dxa"/>
+              <w:left w:w="70" w:type="dxa"/>
+              <w:right w:w="70" w:type="dxa"/>
+            </w:tcMar>
+            <w:shd w:fill="F8FAFC"/>
+          </w:tcPr>
+          <w:p>
+            <w:r>
+              <w:rPr>
+                <w:sz w:val="18"/>
+              </w:rPr>
+              <w:t>Laravel 11, PHP 8.5-FPM, MySQL 8.0, React Native, Tailwind CSS, Python</w:t>
+            </w:r>
+          </w:p>
+        </w:tc>
+      </w:tr>
+    </w:tbl>
+    <w:p>
+      <w:pPr>
+        <w:keepNext/>
+        <w:spacing w:before="180" w:after="60"/>
+      </w:pPr>
+      <w:r>
+        <w:rPr>
+          <w:rFonts w:ascii="Times New Roman" w:hAnsi="Times New Roman"/>
+          <w:b/>
+          <w:color w:val="1E3A8A"/>
+          <w:sz w:val="24"/>
+        </w:rPr>
+        <w:t>2. Team Member Code Contribution &amp; Task Allocation Breakdown</w:t>
+      </w:r>
+    </w:p>
+    <w:p>
+      <w:pPr>
+        <w:spacing w:after="60"/>
+      </w:pPr>
+      <w:r>
+        <w:rPr>
+          <w:sz w:val="19"/>
+        </w:rPr>
+        <w:t>Individual student contribution is tracked via Git author signatures, branch commits, and module ownership:</w:t>
+      </w:r>
+    </w:p>
+    <w:tbl>
+      <w:tblPr>
+        <w:tblW w:type="auto" w:w="0"/>
+        <w:jc w:val="center"/>
+        <w:tblLook w:firstColumn="1" w:firstRow="1" w:lastColumn="0" w:lastRow="0" w:noHBand="0" w:noVBand="1" w:val="04A0"/>
+        <w:tblBorders>
+          <w:top w:val="single" w:sz="6" w:space="0" w:color="CBD5E1"/>
+          <w:left w:val="single" w:sz="4" w:space="0" w:color="CBD5E1"/>
+          <w:bottom w:val="single" w:sz="6" w:space="0" w:color="CBD5E1"/>
+          <w:right w:val="single" w:sz="4" w:space="0" w:color="CBD5E1"/>
+          <w:insideH w:val="single" w:sz="4" w:space="0" w:color="CBD5E1"/>
+          <w:insideV w:val="single" w:sz="4" w:space="0" w:color="CBD5E1"/>
+        </w:tblBorders>
+      </w:tblPr>
+      <w:tblGrid>
+        <w:gridCol w:w="2592"/>
+        <w:gridCol w:w="1872"/>
+        <w:gridCol w:w="3168"/>
+        <w:gridCol w:w="1152"/>
+        <w:gridCol w:w="1008"/>
+      </w:tblGrid>
+      <w:tr>
+        <w:tc>
+          <w:tcPr>
+            <w:tcW w:type="dxa" w:w="1901"/>
+            <w:tcMar>
+              <w:top w:w="35" w:type="dxa"/>
+              <w:bottom w:w="35" w:type="dxa"/>
+              <w:left w:w="50" w:type="dxa"/>
+              <w:right w:w="50" w:type="dxa"/>
+            </w:tcMar>
+            <w:shd w:fill="1E3A8A"/>
+          </w:tcPr>
+          <w:p>
+            <w:pPr>
+              <w:jc w:val="center"/>
+            </w:pPr>
+            <w:r>
+              <w:rPr>
+                <w:b/>
+                <w:color w:val="FFFFFF"/>
+                <w:sz w:val="18"/>
+              </w:rPr>
+              <w:t>Member Name</w:t>
+            </w:r>
+          </w:p>
+        </w:tc>
+        <w:tc>
+          <w:tcPr>
+            <w:tcW w:type="dxa" w:w="1901"/>
+            <w:tcMar>
+              <w:top w:w="35" w:type="dxa"/>
+              <w:bottom w:w="35" w:type="dxa"/>
+              <w:left w:w="50" w:type="dxa"/>
+              <w:right w:w="50" w:type="dxa"/>
+            </w:tcMar>
+            <w:shd w:fill="1E3A8A"/>
+          </w:tcPr>
+          <w:p>
+            <w:pPr>
+              <w:jc w:val="center"/>
+            </w:pPr>
+            <w:r>
+              <w:rPr>
+                <w:b/>
+                <w:color w:val="FFFFFF"/>
+                <w:sz w:val="18"/>
+              </w:rPr>
+              <w:t>Assigned Branch</w:t>
+            </w:r>
+          </w:p>
+        </w:tc>
+        <w:tc>
+          <w:tcPr>
+            <w:tcW w:type="dxa" w:w="1901"/>
+            <w:tcMar>
+              <w:top w:w="35" w:type="dxa"/>
+              <w:bottom w:w="35" w:type="dxa"/>
+              <w:left w:w="50" w:type="dxa"/>
+              <w:right w:w="50" w:type="dxa"/>
+            </w:tcMar>
+            <w:shd w:fill="1E3A8A"/>
+          </w:tcPr>
+          <w:p>
+            <w:pPr>
+              <w:jc w:val="center"/>
+            </w:pPr>
+            <w:r>
+              <w:rPr>
+                <w:b/>
+                <w:color w:val="FFFFFF"/>
+                <w:sz w:val="18"/>
+              </w:rPr>
+              <w:t>Engineering Module &amp; Deliverable</w:t>
+            </w:r>
+          </w:p>
+        </w:tc>
+        <w:tc>
+          <w:tcPr>
+            <w:tcW w:type="dxa" w:w="1901"/>
+            <w:tcMar>
+              <w:top w:w="35" w:type="dxa"/>
+              <w:bottom w:w="35" w:type="dxa"/>
+              <w:left w:w="50" w:type="dxa"/>
+              <w:right w:w="50" w:type="dxa"/>
+            </w:tcMar>
+            <w:shd w:fill="1E3A8A"/>
+          </w:tcPr>
+          <w:p>
+            <w:pPr>
+              <w:jc w:val="center"/>
+            </w:pPr>
+            <w:r>
+              <w:rPr>
+                <w:b/>
+                <w:color w:val="FFFFFF"/>
+                <w:sz w:val="18"/>
+              </w:rPr>
+              <w:t>Commits</w:t>
+            </w:r>
+          </w:p>
+        </w:tc>
+        <w:tc>
+          <w:tcPr>
+            <w:tcW w:type="dxa" w:w="1901"/>
+            <w:tcMar>
+              <w:top w:w="35" w:type="dxa"/>
+              <w:bottom w:w="35" w:type="dxa"/>
+              <w:left w:w="50" w:type="dxa"/>
+              <w:right w:w="50" w:type="dxa"/>
+            </w:tcMar>
+            <w:shd w:fill="1E3A8A"/>
+          </w:tcPr>
+          <w:p>
+            <w:pPr>
+              <w:jc w:val="center"/>
+            </w:pPr>
+            <w:r>
+              <w:rPr>
+                <w:b/>
+                <w:color w:val="FFFFFF"/>
+                <w:sz w:val="18"/>
+              </w:rPr>
+              <w:t>Share</w:t>
+            </w:r>
+          </w:p>
+        </w:tc>
+      </w:tr>
+      <w:tr>
+        <w:tc>
+          <w:tcPr>
+            <w:tcW w:type="dxa" w:w="1901"/>
+            <w:tcMar>
+              <w:top w:w="30" w:type="dxa"/>
+              <w:bottom w:w="30" w:type="dxa"/>
+              <w:left w:w="50" w:type="dxa"/>
+              <w:right w:w="50" w:type="dxa"/>
+            </w:tcMar>
+          </w:tcPr>
+          <w:p>
+            <w:pPr>
+              <w:jc w:val="left"/>
+            </w:pPr>
+            <w:r>
+              <w:rPr>
+                <w:b/>
+                <w:sz w:val="17"/>
+              </w:rPr>
+              <w:t>PATEL SHUBH MAHESHKUMAR</w:t>
+              <w:br/>
+              <w:t>(Team Lead - 246310307123)</w:t>
+            </w:r>
+          </w:p>
+        </w:tc>
+        <w:tc>
+          <w:tcPr>
+            <w:tcW w:type="dxa" w:w="1901"/>
+            <w:tcMar>
+              <w:top w:w="30" w:type="dxa"/>
+              <w:bottom w:w="30" w:type="dxa"/>
+              <w:left w:w="50" w:type="dxa"/>
+              <w:right w:w="50" w:type="dxa"/>
+            </w:tcMar>
+          </w:tcPr>
+          <w:p>
+            <w:pPr>
+              <w:jc w:val="center"/>
+            </w:pPr>
+            <w:r>
+              <w:rPr>
+                <w:sz w:val="17"/>
+              </w:rPr>
+              <w:t>feature-teamlead</w:t>
+              <w:br/>
+              <w:t>&amp; main</w:t>
+            </w:r>
+          </w:p>
+        </w:tc>
+        <w:tc>
+          <w:tcPr>
+            <w:tcW w:type="dxa" w:w="1901"/>
+            <w:tcMar>
+              <w:top w:w="30" w:type="dxa"/>
+              <w:bottom w:w="30" w:type="dxa"/>
+              <w:left w:w="50" w:type="dxa"/>
+              <w:right w:w="50" w:type="dxa"/>
+            </w:tcMar>
+          </w:tcPr>
+          <w:p>
+            <w:pPr>
+              <w:jc w:val="left"/>
+            </w:pPr>
+            <w:r>
+              <w:rPr>
+                <w:sz w:val="17"/>
+              </w:rPr>
+              <w:t>Architecture, Laravel 11 Backend API, MySQL 3NF DB, Multi-Tenant Scope, AWS EC2 Deploy</w:t>
+            </w:r>
+          </w:p>
+        </w:tc>
+        <w:tc>
+          <w:tcPr>
+            <w:tcW w:type="dxa" w:w="1901"/>
+            <w:tcMar>
+              <w:top w:w="30" w:type="dxa"/>
+              <w:bottom w:w="30" w:type="dxa"/>
+              <w:left w:w="50" w:type="dxa"/>
+              <w:right w:w="50" w:type="dxa"/>
+            </w:tcMar>
+          </w:tcPr>
+          <w:p>
+            <w:pPr>
+              <w:jc w:val="center"/>
+            </w:pPr>
+            <w:r>
+              <w:rPr>
+                <w:b/>
+                <w:color w:val="1E3A8A"/>
+                <w:sz w:val="17"/>
+              </w:rPr>
+              <w:t>1,422</w:t>
+            </w:r>
+          </w:p>
+        </w:tc>
+        <w:tc>
+          <w:tcPr>
+            <w:tcW w:type="dxa" w:w="1901"/>
+            <w:tcMar>
+              <w:top w:w="30" w:type="dxa"/>
+              <w:bottom w:w="30" w:type="dxa"/>
+              <w:left w:w="50" w:type="dxa"/>
+              <w:right w:w="50" w:type="dxa"/>
+            </w:tcMar>
+          </w:tcPr>
+          <w:p>
+            <w:pPr>
+              <w:jc w:val="center"/>
+            </w:pPr>
+            <w:r>
+              <w:rPr>
+                <w:b/>
+                <w:color w:val="059669"/>
+                <w:sz w:val="17"/>
+              </w:rPr>
+              <w:t>80%</w:t>
+            </w:r>
+          </w:p>
+        </w:tc>
+      </w:tr>
+      <w:tr>
+        <w:tc>
+          <w:tcPr>
+            <w:tcW w:type="dxa" w:w="1901"/>
+            <w:tcMar>
+              <w:top w:w="30" w:type="dxa"/>
+              <w:bottom w:w="30" w:type="dxa"/>
+              <w:left w:w="50" w:type="dxa"/>
+              <w:right w:w="50" w:type="dxa"/>
+            </w:tcMar>
+            <w:shd w:fill="F8FAFC"/>
+          </w:tcPr>
+          <w:p>
+            <w:pPr>
+              <w:jc w:val="left"/>
+            </w:pPr>
+            <w:r>
+              <w:rPr>
+                <w:b/>
+                <w:sz w:val="17"/>
+              </w:rPr>
+              <w:t>Krushank Dave</w:t>
+              <w:br/>
+              <w:t>(Team Member)</w:t>
+            </w:r>
+          </w:p>
+        </w:tc>
+        <w:tc>
+          <w:tcPr>
+            <w:tcW w:type="dxa" w:w="1901"/>
+            <w:tcMar>
+              <w:top w:w="30" w:type="dxa"/>
+              <w:bottom w:w="30" w:type="dxa"/>
+              <w:left w:w="50" w:type="dxa"/>
+              <w:right w:w="50" w:type="dxa"/>
+            </w:tcMar>
+            <w:shd w:fill="F8FAFC"/>
+          </w:tcPr>
+          <w:p>
+            <w:pPr>
+              <w:jc w:val="center"/>
+            </w:pPr>
+            <w:r>
+              <w:rPr>
+                <w:sz w:val="17"/>
+              </w:rPr>
+              <w:t>feature-krushank</w:t>
+            </w:r>
+          </w:p>
+        </w:tc>
+        <w:tc>
+          <w:tcPr>
+            <w:tcW w:type="dxa" w:w="1901"/>
+            <w:tcMar>
+              <w:top w:w="30" w:type="dxa"/>
+              <w:bottom w:w="30" w:type="dxa"/>
+              <w:left w:w="50" w:type="dxa"/>
+              <w:right w:w="50" w:type="dxa"/>
+            </w:tcMar>
+            <w:shd w:fill="F8FAFC"/>
+          </w:tcPr>
+          <w:p>
+            <w:pPr>
+              <w:jc w:val="left"/>
+            </w:pPr>
+            <w:r>
+              <w:rPr>
+                <w:sz w:val="17"/>
+              </w:rPr>
+              <w:t>Cashier Web POS Screen, F1-F9 Shortcuts, Desktop POS Module &amp; Local Storage</w:t>
+            </w:r>
+          </w:p>
+        </w:tc>
+        <w:tc>
+          <w:tcPr>
+            <w:tcW w:type="dxa" w:w="1901"/>
+            <w:tcMar>
+              <w:top w:w="30" w:type="dxa"/>
+              <w:bottom w:w="30" w:type="dxa"/>
+              <w:left w:w="50" w:type="dxa"/>
+              <w:right w:w="50" w:type="dxa"/>
+            </w:tcMar>
+            <w:shd w:fill="F8FAFC"/>
+          </w:tcPr>
+          <w:p>
+            <w:pPr>
+              <w:jc w:val="center"/>
+            </w:pPr>
+            <w:r>
+              <w:rPr>
+                <w:b/>
+                <w:color w:val="1E3A8A"/>
+                <w:sz w:val="17"/>
+              </w:rPr>
+              <w:t>68</w:t>
+            </w:r>
+          </w:p>
+        </w:tc>
+        <w:tc>
+          <w:tcPr>
+            <w:tcW w:type="dxa" w:w="1901"/>
+            <w:tcMar>
+              <w:top w:w="30" w:type="dxa"/>
+              <w:bottom w:w="30" w:type="dxa"/>
+              <w:left w:w="50" w:type="dxa"/>
+              <w:right w:w="50" w:type="dxa"/>
+            </w:tcMar>
+            <w:shd w:fill="F8FAFC"/>
+          </w:tcPr>
+          <w:p>
+            <w:pPr>
+              <w:jc w:val="center"/>
+            </w:pPr>
+            <w:r>
+              <w:rPr>
+                <w:b/>
+                <w:color w:val="059669"/>
+                <w:sz w:val="17"/>
+              </w:rPr>
+              <w:t>10%</w:t>
+            </w:r>
+          </w:p>
+        </w:tc>
+      </w:tr>
+      <w:tr>
+        <w:tc>
+          <w:tcPr>
+            <w:tcW w:type="dxa" w:w="1901"/>
+            <w:tcMar>
+              <w:top w:w="30" w:type="dxa"/>
+              <w:bottom w:w="30" w:type="dxa"/>
+              <w:left w:w="50" w:type="dxa"/>
+              <w:right w:w="50" w:type="dxa"/>
+            </w:tcMar>
+          </w:tcPr>
+          <w:p>
+            <w:pPr>
+              <w:jc w:val="left"/>
+            </w:pPr>
+            <w:r>
+              <w:rPr>
+                <w:b/>
+                <w:sz w:val="17"/>
+              </w:rPr>
+              <w:t>Fiyans Patel</w:t>
+              <w:br/>
+              <w:t>(Team Member)</w:t>
+            </w:r>
+          </w:p>
+        </w:tc>
+        <w:tc>
+          <w:tcPr>
+            <w:tcW w:type="dxa" w:w="1901"/>
+            <w:tcMar>
+              <w:top w:w="30" w:type="dxa"/>
+              <w:bottom w:w="30" w:type="dxa"/>
+              <w:left w:w="50" w:type="dxa"/>
+              <w:right w:w="50" w:type="dxa"/>
+            </w:tcMar>
+          </w:tcPr>
+          <w:p>
+            <w:pPr>
+              <w:jc w:val="center"/>
+            </w:pPr>
+            <w:r>
+              <w:rPr>
+                <w:sz w:val="17"/>
+              </w:rPr>
+              <w:t>feature-fiyans</w:t>
+            </w:r>
+          </w:p>
+        </w:tc>
+        <w:tc>
+          <w:tcPr>
+            <w:tcW w:type="dxa" w:w="1901"/>
+            <w:tcMar>
+              <w:top w:w="30" w:type="dxa"/>
+              <w:bottom w:w="30" w:type="dxa"/>
+              <w:left w:w="50" w:type="dxa"/>
+              <w:right w:w="50" w:type="dxa"/>
+            </w:tcMar>
+          </w:tcPr>
+          <w:p>
+            <w:pPr>
+              <w:jc w:val="left"/>
+            </w:pPr>
+            <w:r>
+              <w:rPr>
+                <w:sz w:val="17"/>
+              </w:rPr>
+              <w:t>Admin Inventory ERP, Recipe BOM Depletion Logic, Dynamic Table QR Generator</w:t>
+            </w:r>
+          </w:p>
+        </w:tc>
+        <w:tc>
+          <w:tcPr>
+            <w:tcW w:type="dxa" w:w="1901"/>
+            <w:tcMar>
+              <w:top w:w="30" w:type="dxa"/>
+              <w:bottom w:w="30" w:type="dxa"/>
+              <w:left w:w="50" w:type="dxa"/>
+              <w:right w:w="50" w:type="dxa"/>
+            </w:tcMar>
+          </w:tcPr>
+          <w:p>
+            <w:pPr>
+              <w:jc w:val="center"/>
+            </w:pPr>
+            <w:r>
+              <w:rPr>
+                <w:b/>
+                <w:color w:val="1E3A8A"/>
+                <w:sz w:val="17"/>
+              </w:rPr>
+              <w:t>32</w:t>
+            </w:r>
+          </w:p>
+        </w:tc>
+        <w:tc>
+          <w:tcPr>
+            <w:tcW w:type="dxa" w:w="1901"/>
+            <w:tcMar>
+              <w:top w:w="30" w:type="dxa"/>
+              <w:bottom w:w="30" w:type="dxa"/>
+              <w:left w:w="50" w:type="dxa"/>
+              <w:right w:w="50" w:type="dxa"/>
+            </w:tcMar>
+          </w:tcPr>
+          <w:p>
+            <w:pPr>
+              <w:jc w:val="center"/>
+            </w:pPr>
+            <w:r>
+              <w:rPr>
+                <w:b/>
+                <w:color w:val="059669"/>
+                <w:sz w:val="17"/>
+              </w:rPr>
+              <w:t>6%</w:t>
+            </w:r>
+          </w:p>
+        </w:tc>
+      </w:tr>
+      <w:tr>
+        <w:tc>
+          <w:tcPr>
+            <w:tcW w:type="dxa" w:w="1901"/>
+            <w:tcMar>
+              <w:top w:w="30" w:type="dxa"/>
+              <w:bottom w:w="30" w:type="dxa"/>
+              <w:left w:w="50" w:type="dxa"/>
+              <w:right w:w="50" w:type="dxa"/>
+            </w:tcMar>
+            <w:shd w:fill="F8FAFC"/>
+          </w:tcPr>
+          <w:p>
+            <w:pPr>
+              <w:jc w:val="left"/>
+            </w:pPr>
+            <w:r>
+              <w:rPr>
+                <w:b/>
+                <w:sz w:val="17"/>
+              </w:rPr>
+              <w:t>Veer Prajapati</w:t>
+              <w:br/>
+              <w:t>(Team Member)</w:t>
+            </w:r>
+          </w:p>
+        </w:tc>
+        <w:tc>
+          <w:tcPr>
+            <w:tcW w:type="dxa" w:w="1901"/>
+            <w:tcMar>
+              <w:top w:w="30" w:type="dxa"/>
+              <w:bottom w:w="30" w:type="dxa"/>
+              <w:left w:w="50" w:type="dxa"/>
+              <w:right w:w="50" w:type="dxa"/>
+            </w:tcMar>
+            <w:shd w:fill="F8FAFC"/>
+          </w:tcPr>
+          <w:p>
+            <w:pPr>
+              <w:jc w:val="center"/>
+            </w:pPr>
+            <w:r>
+              <w:rPr>
+                <w:sz w:val="17"/>
+              </w:rPr>
+              <w:t>feature-veer</w:t>
+            </w:r>
+          </w:p>
+        </w:tc>
+        <w:tc>
+          <w:tcPr>
+            <w:tcW w:type="dxa" w:w="1901"/>
+            <w:tcMar>
+              <w:top w:w="30" w:type="dxa"/>
+              <w:bottom w:w="30" w:type="dxa"/>
+              <w:left w:w="50" w:type="dxa"/>
+              <w:right w:w="50" w:type="dxa"/>
+            </w:tcMar>
+            <w:shd w:fill="F8FAFC"/>
+          </w:tcPr>
+          <w:p>
+            <w:pPr>
+              <w:jc w:val="left"/>
+            </w:pPr>
+            <w:r>
+              <w:rPr>
+                <w:sz w:val="17"/>
+              </w:rPr>
+              <w:t>Customer Digital Cart Drawer, Mobile UI Layouts &amp; Real-Time KDS Polling Stepper</w:t>
+            </w:r>
+          </w:p>
+        </w:tc>
+        <w:tc>
+          <w:tcPr>
+            <w:tcW w:type="dxa" w:w="1901"/>
+            <w:tcMar>
+              <w:top w:w="30" w:type="dxa"/>
+              <w:bottom w:w="30" w:type="dxa"/>
+              <w:left w:w="50" w:type="dxa"/>
+              <w:right w:w="50" w:type="dxa"/>
+            </w:tcMar>
+            <w:shd w:fill="F8FAFC"/>
+          </w:tcPr>
+          <w:p>
+            <w:pPr>
+              <w:jc w:val="center"/>
+            </w:pPr>
+            <w:r>
+              <w:rPr>
+                <w:b/>
+                <w:color w:val="1E3A8A"/>
+                <w:sz w:val="17"/>
+              </w:rPr>
+              <w:t>10</w:t>
+            </w:r>
+          </w:p>
+        </w:tc>
+        <w:tc>
+          <w:tcPr>
+            <w:tcW w:type="dxa" w:w="1901"/>
+            <w:tcMar>
+              <w:top w:w="30" w:type="dxa"/>
+              <w:bottom w:w="30" w:type="dxa"/>
+              <w:left w:w="50" w:type="dxa"/>
+              <w:right w:w="50" w:type="dxa"/>
+            </w:tcMar>
+            <w:shd w:fill="F8FAFC"/>
+          </w:tcPr>
+          <w:p>
+            <w:pPr>
+              <w:jc w:val="center"/>
+            </w:pPr>
+            <w:r>
+              <w:rPr>
+                <w:b/>
+                <w:color w:val="059669"/>
+                <w:sz w:val="17"/>
+              </w:rPr>
+              <w:t>4%</w:t>
+            </w:r>
+          </w:p>
+        </w:tc>
+      </w:tr>
+    </w:tbl>
+    <w:p>
+      <w:r>
+        <w:br w:type="page"/>
+      </w:r>
+    </w:p>
+    <w:p>
+      <w:pPr>
+        <w:keepNext/>
+        <w:spacing w:before="180" w:after="60"/>
+      </w:pPr>
+      <w:r>
+        <w:rPr>
+          <w:rFonts w:ascii="Times New Roman" w:hAnsi="Times New Roman"/>
+          <w:b/>
+          <w:color w:val="1E3A8A"/>
+          <w:sz w:val="24"/>
+        </w:rPr>
+        <w:t>3. Key Chronological Milestone Commits (Sample from 1,532+ Commits)</w:t>
+      </w:r>
+    </w:p>
+    <w:p>
+      <w:pPr>
+        <w:spacing w:after="80"/>
+      </w:pPr>
+      <w:r>
+        <w:rPr>
+          <w:sz w:val="17"/>
+        </w:rPr>
+        <w:t xml:space="preserve">Note: To keep physical print copies concise, the table below highlights representative milestone commits across all team members. The full commit log (1,532+ commits) is accessible via: </w:t>
+      </w:r>
+      <w:r>
+        <w:rPr>
+          <w:b/>
+          <w:color w:val="1D4ED8"/>
+          <w:sz w:val="17"/>
+        </w:rPr>
+        <w:t>https://github.com/Shubh-Patel-07/DineFlow-AI/commits</w:t>
+      </w:r>
+    </w:p>
+    <w:tbl>
+      <w:tblPr>
+        <w:tblW w:type="auto" w:w="0"/>
+        <w:jc w:val="center"/>
+        <w:tblLook w:firstColumn="1" w:firstRow="1" w:lastColumn="0" w:lastRow="0" w:noHBand="0" w:noVBand="1" w:val="04A0"/>
+        <w:tblBorders>
+          <w:top w:val="single" w:sz="6" w:space="0" w:color="CBD5E1"/>
+          <w:left w:val="single" w:sz="4" w:space="0" w:color="CBD5E1"/>
+          <w:bottom w:val="single" w:sz="6" w:space="0" w:color="CBD5E1"/>
+          <w:right w:val="single" w:sz="4" w:space="0" w:color="CBD5E1"/>
+          <w:insideH w:val="single" w:sz="4" w:space="0" w:color="CBD5E1"/>
+          <w:insideV w:val="single" w:sz="4" w:space="0" w:color="CBD5E1"/>
+        </w:tblBorders>
+      </w:tblPr>
+      <w:tblGrid>
+        <w:gridCol w:w="1296"/>
+        <w:gridCol w:w="1440"/>
+        <w:gridCol w:w="2016"/>
+        <w:gridCol w:w="5040"/>
+      </w:tblGrid>
+      <w:tr>
+        <w:tc>
+          <w:tcPr>
+            <w:tcW w:type="dxa" w:w="2376"/>
+            <w:tcMar>
+              <w:top w:w="35" w:type="dxa"/>
+              <w:bottom w:w="35" w:type="dxa"/>
+              <w:left w:w="50" w:type="dxa"/>
+              <w:right w:w="50" w:type="dxa"/>
+            </w:tcMar>
+            <w:shd w:fill="1E3A8A"/>
+          </w:tcPr>
+          <w:p>
+            <w:pPr>
+              <w:jc w:val="center"/>
+            </w:pPr>
+            <w:r>
+              <w:rPr>
+                <w:b/>
+                <w:color w:val="FFFFFF"/>
+                <w:sz w:val="18"/>
+              </w:rPr>
+              <w:t>Commit SHA</w:t>
+            </w:r>
+          </w:p>
+        </w:tc>
+        <w:tc>
+          <w:tcPr>
+            <w:tcW w:type="dxa" w:w="2376"/>
+            <w:tcMar>
+              <w:top w:w="35" w:type="dxa"/>
+              <w:bottom w:w="35" w:type="dxa"/>
+              <w:left w:w="50" w:type="dxa"/>
+              <w:right w:w="50" w:type="dxa"/>
+            </w:tcMar>
+            <w:shd w:fill="1E3A8A"/>
+          </w:tcPr>
+          <w:p>
+            <w:pPr>
+              <w:jc w:val="center"/>
+            </w:pPr>
+            <w:r>
+              <w:rPr>
+                <w:b/>
+                <w:color w:val="FFFFFF"/>
+                <w:sz w:val="18"/>
+              </w:rPr>
+              <w:t>Date</w:t>
+            </w:r>
+          </w:p>
+        </w:tc>
+        <w:tc>
+          <w:tcPr>
+            <w:tcW w:type="dxa" w:w="2376"/>
+            <w:tcMar>
+              <w:top w:w="35" w:type="dxa"/>
+              <w:bottom w:w="35" w:type="dxa"/>
+              <w:left w:w="50" w:type="dxa"/>
+              <w:right w:w="50" w:type="dxa"/>
+            </w:tcMar>
+            <w:shd w:fill="1E3A8A"/>
+          </w:tcPr>
+          <w:p>
+            <w:pPr>
+              <w:jc w:val="center"/>
+            </w:pPr>
+            <w:r>
+              <w:rPr>
+                <w:b/>
+                <w:color w:val="FFFFFF"/>
+                <w:sz w:val="18"/>
+              </w:rPr>
+              <w:t>Author</w:t>
+            </w:r>
+          </w:p>
+        </w:tc>
+        <w:tc>
+          <w:tcPr>
+            <w:tcW w:type="dxa" w:w="2376"/>
+            <w:tcMar>
+              <w:top w:w="35" w:type="dxa"/>
+              <w:bottom w:w="35" w:type="dxa"/>
+              <w:left w:w="50" w:type="dxa"/>
+              <w:right w:w="50" w:type="dxa"/>
+            </w:tcMar>
+            <w:shd w:fill="1E3A8A"/>
+          </w:tcPr>
+          <w:p>
+            <w:pPr>
+              <w:jc w:val="center"/>
+            </w:pPr>
+            <w:r>
+              <w:rPr>
+                <w:b/>
+                <w:color w:val="FFFFFF"/>
+                <w:sz w:val="18"/>
+              </w:rPr>
+              <w:t>Engineering Commit Deliverable Summary</w:t>
+            </w:r>
+          </w:p>
+        </w:tc>
+      </w:tr>
+      <w:tr>
+        <w:tc>
+          <w:tcPr>
+            <w:tcW w:type="dxa" w:w="2376"/>
+            <w:tcMar>
+              <w:top w:w="25" w:type="dxa"/>
+              <w:bottom w:w="25" w:type="dxa"/>
+              <w:left w:w="30" w:type="dxa"/>
+              <w:right w:w="30" w:type="dxa"/>
+            </w:tcMar>
+          </w:tcPr>
+          <w:p>
+            <w:pPr>
+              <w:jc w:val="center"/>
+            </w:pPr>
+            <w:r>
+              <w:rPr>
+                <w:rFonts w:ascii="Consolas" w:hAnsi="Consolas"/>
+                <w:b/>
+                <w:color w:val="1E3A8A"/>
+                <w:sz w:val="16"/>
+              </w:rPr>
+              <w:t>749c654</w:t>
+            </w:r>
+          </w:p>
+        </w:tc>
+        <w:tc>
+          <w:tcPr>
+            <w:tcW w:type="dxa" w:w="2376"/>
+            <w:tcMar>
+              <w:top w:w="25" w:type="dxa"/>
+              <w:bottom w:w="25" w:type="dxa"/>
+              <w:left w:w="30" w:type="dxa"/>
+              <w:right w:w="30" w:type="dxa"/>
+            </w:tcMar>
+          </w:tcPr>
+          <w:p>
+            <w:pPr>
+              <w:jc w:val="center"/>
+            </w:pPr>
+            <w:r>
+              <w:rPr>
+                <w:sz w:val="16"/>
+              </w:rPr>
+              <w:t>2026-10-28</w:t>
+            </w:r>
+          </w:p>
+        </w:tc>
+        <w:tc>
+          <w:tcPr>
+            <w:tcW w:type="dxa" w:w="2376"/>
+            <w:tcMar>
+              <w:top w:w="25" w:type="dxa"/>
+              <w:bottom w:w="25" w:type="dxa"/>
+              <w:left w:w="40" w:type="dxa"/>
+              <w:right w:w="40" w:type="dxa"/>
+            </w:tcMar>
+          </w:tcPr>
+          <w:p>
+            <w:pPr>
+              <w:jc w:val="center"/>
+            </w:pPr>
+            <w:r>
+              <w:rPr>
+                <w:b/>
+                <w:color w:val="1E3A8A"/>
+                <w:sz w:val="16"/>
+              </w:rPr>
+              <w:t>Shubh Patel</w:t>
+            </w:r>
+          </w:p>
+        </w:tc>
+        <w:tc>
+          <w:tcPr>
+            <w:tcW w:type="dxa" w:w="2376"/>
+            <w:tcMar>
+              <w:top w:w="25" w:type="dxa"/>
+              <w:bottom w:w="25" w:type="dxa"/>
+              <w:left w:w="50" w:type="dxa"/>
+              <w:right w:w="50" w:type="dxa"/>
+            </w:tcMar>
+          </w:tcPr>
+          <w:p>
+            <w:r>
+              <w:rPr>
+                <w:sz w:val="16"/>
+              </w:rPr>
+              <w:t>docs(gtu): align Slide 3 industry stats and Slide 11 4-stage build sequence with GTU demo PPT</w:t>
+            </w:r>
+          </w:p>
+        </w:tc>
+      </w:tr>
+      <w:tr>
+        <w:tc>
+          <w:tcPr>
+            <w:tcW w:type="dxa" w:w="2376"/>
+            <w:tcMar>
+              <w:top w:w="25" w:type="dxa"/>
+              <w:bottom w:w="25" w:type="dxa"/>
+              <w:left w:w="30" w:type="dxa"/>
+              <w:right w:w="30" w:type="dxa"/>
+            </w:tcMar>
+            <w:shd w:fill="F8FAFC"/>
+          </w:tcPr>
+          <w:p>
+            <w:pPr>
+              <w:jc w:val="center"/>
+            </w:pPr>
+            <w:r>
+              <w:rPr>
+                <w:rFonts w:ascii="Consolas" w:hAnsi="Consolas"/>
+                <w:b/>
+                <w:color w:val="1E3A8A"/>
+                <w:sz w:val="16"/>
+              </w:rPr>
+              <w:t>132c046</w:t>
+            </w:r>
+          </w:p>
+        </w:tc>
+        <w:tc>
+          <w:tcPr>
+            <w:tcW w:type="dxa" w:w="2376"/>
+            <w:tcMar>
+              <w:top w:w="25" w:type="dxa"/>
+              <w:bottom w:w="25" w:type="dxa"/>
+              <w:left w:w="30" w:type="dxa"/>
+              <w:right w:w="30" w:type="dxa"/>
+            </w:tcMar>
+            <w:shd w:fill="F8FAFC"/>
+          </w:tcPr>
+          <w:p>
+            <w:pPr>
+              <w:jc w:val="center"/>
+            </w:pPr>
+            <w:r>
+              <w:rPr>
+                <w:sz w:val="16"/>
+              </w:rPr>
+              <w:t>2026-10-28</w:t>
+            </w:r>
+          </w:p>
+        </w:tc>
+        <w:tc>
+          <w:tcPr>
+            <w:tcW w:type="dxa" w:w="2376"/>
+            <w:tcMar>
+              <w:top w:w="25" w:type="dxa"/>
+              <w:bottom w:w="25" w:type="dxa"/>
+              <w:left w:w="40" w:type="dxa"/>
+              <w:right w:w="40" w:type="dxa"/>
+            </w:tcMar>
+            <w:shd w:fill="F8FAFC"/>
+          </w:tcPr>
+          <w:p>
+            <w:pPr>
+              <w:jc w:val="center"/>
+            </w:pPr>
+            <w:r>
+              <w:rPr>
+                <w:b/>
+                <w:color w:val="1E3A8A"/>
+                <w:sz w:val="16"/>
+              </w:rPr>
+              <w:t>Shubh Patel</w:t>
+            </w:r>
+          </w:p>
+        </w:tc>
+        <w:tc>
+          <w:tcPr>
+            <w:tcW w:type="dxa" w:w="2376"/>
+            <w:tcMar>
+              <w:top w:w="25" w:type="dxa"/>
+              <w:bottom w:w="25" w:type="dxa"/>
+              <w:left w:w="50" w:type="dxa"/>
+              <w:right w:w="50" w:type="dxa"/>
+            </w:tcMar>
+            <w:shd w:fill="F8FAFC"/>
+          </w:tcPr>
+          <w:p>
+            <w:r>
+              <w:rPr>
+                <w:sz w:val="16"/>
+              </w:rPr>
+              <w:t>docs(gtu): remove BOM section, format algorithms in formal CS boxes, convert PPT to light theme</w:t>
+            </w:r>
+          </w:p>
+        </w:tc>
+      </w:tr>
+      <w:tr>
+        <w:tc>
+          <w:tcPr>
+            <w:tcW w:type="dxa" w:w="2376"/>
+            <w:tcMar>
+              <w:top w:w="25" w:type="dxa"/>
+              <w:bottom w:w="25" w:type="dxa"/>
+              <w:left w:w="30" w:type="dxa"/>
+              <w:right w:w="30" w:type="dxa"/>
+            </w:tcMar>
+          </w:tcPr>
+          <w:p>
+            <w:pPr>
+              <w:jc w:val="center"/>
+            </w:pPr>
+            <w:r>
+              <w:rPr>
+                <w:rFonts w:ascii="Consolas" w:hAnsi="Consolas"/>
+                <w:b/>
+                <w:color w:val="1E3A8A"/>
+                <w:sz w:val="16"/>
+              </w:rPr>
+              <w:t>b338628</w:t>
+            </w:r>
+          </w:p>
+        </w:tc>
+        <w:tc>
+          <w:tcPr>
+            <w:tcW w:type="dxa" w:w="2376"/>
+            <w:tcMar>
+              <w:top w:w="25" w:type="dxa"/>
+              <w:bottom w:w="25" w:type="dxa"/>
+              <w:left w:w="30" w:type="dxa"/>
+              <w:right w:w="30" w:type="dxa"/>
+            </w:tcMar>
+          </w:tcPr>
+          <w:p>
+            <w:pPr>
+              <w:jc w:val="center"/>
+            </w:pPr>
+            <w:r>
+              <w:rPr>
+                <w:sz w:val="16"/>
+              </w:rPr>
+              <w:t>2026-10-28</w:t>
+            </w:r>
+          </w:p>
+        </w:tc>
+        <w:tc>
+          <w:tcPr>
+            <w:tcW w:type="dxa" w:w="2376"/>
+            <w:tcMar>
+              <w:top w:w="25" w:type="dxa"/>
+              <w:bottom w:w="25" w:type="dxa"/>
+              <w:left w:w="40" w:type="dxa"/>
+              <w:right w:w="40" w:type="dxa"/>
+            </w:tcMar>
+          </w:tcPr>
+          <w:p>
+            <w:pPr>
+              <w:jc w:val="center"/>
+            </w:pPr>
+            <w:r>
+              <w:rPr>
+                <w:b/>
+                <w:color w:val="1E3A8A"/>
+                <w:sz w:val="16"/>
+              </w:rPr>
+              <w:t>Shubh Patel</w:t>
+            </w:r>
+          </w:p>
+        </w:tc>
+        <w:tc>
+          <w:tcPr>
+            <w:tcW w:type="dxa" w:w="2376"/>
+            <w:tcMar>
+              <w:top w:w="25" w:type="dxa"/>
+              <w:bottom w:w="25" w:type="dxa"/>
+              <w:left w:w="50" w:type="dxa"/>
+              <w:right w:w="50" w:type="dxa"/>
+            </w:tcMar>
+          </w:tcPr>
+          <w:p>
+            <w:r>
+              <w:rPr>
+                <w:sz w:val="16"/>
+              </w:rPr>
+              <w:t>docs(gtu): finalize 18-slide PPTX, 8-chapter DOCX report with embedded block/circuit/flowchart diagrams</w:t>
+            </w:r>
+          </w:p>
+        </w:tc>
+      </w:tr>
+      <w:tr>
+        <w:tc>
+          <w:tcPr>
+            <w:tcW w:type="dxa" w:w="2376"/>
+            <w:tcMar>
+              <w:top w:w="25" w:type="dxa"/>
+              <w:bottom w:w="25" w:type="dxa"/>
+              <w:left w:w="30" w:type="dxa"/>
+              <w:right w:w="30" w:type="dxa"/>
+            </w:tcMar>
+            <w:shd w:fill="F8FAFC"/>
+          </w:tcPr>
+          <w:p>
+            <w:pPr>
+              <w:jc w:val="center"/>
+            </w:pPr>
+            <w:r>
+              <w:rPr>
+                <w:rFonts w:ascii="Consolas" w:hAnsi="Consolas"/>
+                <w:b/>
+                <w:color w:val="1E3A8A"/>
+                <w:sz w:val="16"/>
+              </w:rPr>
+              <w:t>5fe6564</w:t>
+            </w:r>
+          </w:p>
+        </w:tc>
+        <w:tc>
+          <w:tcPr>
+            <w:tcW w:type="dxa" w:w="2376"/>
+            <w:tcMar>
+              <w:top w:w="25" w:type="dxa"/>
+              <w:bottom w:w="25" w:type="dxa"/>
+              <w:left w:w="30" w:type="dxa"/>
+              <w:right w:w="30" w:type="dxa"/>
+            </w:tcMar>
+            <w:shd w:fill="F8FAFC"/>
+          </w:tcPr>
+          <w:p>
+            <w:pPr>
+              <w:jc w:val="center"/>
+            </w:pPr>
+            <w:r>
+              <w:rPr>
+                <w:sz w:val="16"/>
+              </w:rPr>
+              <w:t>2026-08-25</w:t>
+            </w:r>
+          </w:p>
+        </w:tc>
+        <w:tc>
+          <w:tcPr>
+            <w:tcW w:type="dxa" w:w="2376"/>
+            <w:tcMar>
+              <w:top w:w="25" w:type="dxa"/>
+              <w:bottom w:w="25" w:type="dxa"/>
+              <w:left w:w="40" w:type="dxa"/>
+              <w:right w:w="40" w:type="dxa"/>
+            </w:tcMar>
+            <w:shd w:fill="F8FAFC"/>
+          </w:tcPr>
+          <w:p>
+            <w:pPr>
+              <w:jc w:val="center"/>
+            </w:pPr>
+            <w:r>
+              <w:rPr>
+                <w:b/>
+                <w:color w:val="059669"/>
+                <w:sz w:val="16"/>
+              </w:rPr>
+              <w:t>Krushank Dave</w:t>
+            </w:r>
+          </w:p>
+        </w:tc>
+        <w:tc>
+          <w:tcPr>
+            <w:tcW w:type="dxa" w:w="2376"/>
+            <w:tcMar>
+              <w:top w:w="25" w:type="dxa"/>
+              <w:bottom w:w="25" w:type="dxa"/>
+              <w:left w:w="50" w:type="dxa"/>
+              <w:right w:w="50" w:type="dxa"/>
+            </w:tcMar>
+            <w:shd w:fill="F8FAFC"/>
+          </w:tcPr>
+          <w:p>
+            <w:r>
+              <w:rPr>
+                <w:sz w:val="16"/>
+              </w:rPr>
+              <w:t>feat(desktop-menu): implement Electron window lifecycle, background Laravel runner, and local menu repository</w:t>
+            </w:r>
+          </w:p>
+        </w:tc>
+      </w:tr>
+      <w:tr>
+        <w:tc>
+          <w:tcPr>
+            <w:tcW w:type="dxa" w:w="2376"/>
+            <w:tcMar>
+              <w:top w:w="25" w:type="dxa"/>
+              <w:bottom w:w="25" w:type="dxa"/>
+              <w:left w:w="30" w:type="dxa"/>
+              <w:right w:w="30" w:type="dxa"/>
+            </w:tcMar>
+          </w:tcPr>
+          <w:p>
+            <w:pPr>
+              <w:jc w:val="center"/>
+            </w:pPr>
+            <w:r>
+              <w:rPr>
+                <w:rFonts w:ascii="Consolas" w:hAnsi="Consolas"/>
+                <w:b/>
+                <w:color w:val="1E3A8A"/>
+                <w:sz w:val="16"/>
+              </w:rPr>
+              <w:t>70b4cfa</w:t>
+            </w:r>
+          </w:p>
+        </w:tc>
+        <w:tc>
+          <w:tcPr>
+            <w:tcW w:type="dxa" w:w="2376"/>
+            <w:tcMar>
+              <w:top w:w="25" w:type="dxa"/>
+              <w:bottom w:w="25" w:type="dxa"/>
+              <w:left w:w="30" w:type="dxa"/>
+              <w:right w:w="30" w:type="dxa"/>
+            </w:tcMar>
+          </w:tcPr>
+          <w:p>
+            <w:pPr>
+              <w:jc w:val="center"/>
+            </w:pPr>
+            <w:r>
+              <w:rPr>
+                <w:sz w:val="16"/>
+              </w:rPr>
+              <w:t>2026-08-20</w:t>
+            </w:r>
+          </w:p>
+        </w:tc>
+        <w:tc>
+          <w:tcPr>
+            <w:tcW w:type="dxa" w:w="2376"/>
+            <w:tcMar>
+              <w:top w:w="25" w:type="dxa"/>
+              <w:bottom w:w="25" w:type="dxa"/>
+              <w:left w:w="40" w:type="dxa"/>
+              <w:right w:w="40" w:type="dxa"/>
+            </w:tcMar>
+          </w:tcPr>
+          <w:p>
+            <w:pPr>
+              <w:jc w:val="center"/>
+            </w:pPr>
+            <w:r>
+              <w:rPr>
+                <w:b/>
+                <w:color w:val="059669"/>
+                <w:sz w:val="16"/>
+              </w:rPr>
+              <w:t>Fiyans Patel</w:t>
+            </w:r>
+          </w:p>
+        </w:tc>
+        <w:tc>
+          <w:tcPr>
+            <w:tcW w:type="dxa" w:w="2376"/>
+            <w:tcMar>
+              <w:top w:w="25" w:type="dxa"/>
+              <w:bottom w:w="25" w:type="dxa"/>
+              <w:left w:w="50" w:type="dxa"/>
+              <w:right w:w="50" w:type="dxa"/>
+            </w:tcMar>
+          </w:tcPr>
+          <w:p>
+            <w:r>
+              <w:rPr>
+                <w:sz w:val="16"/>
+              </w:rPr>
+              <w:t>docs(inventory-spec): add inventory and table management SRS document with stock threshold logic</w:t>
+            </w:r>
+          </w:p>
+        </w:tc>
+      </w:tr>
+      <w:tr>
+        <w:tc>
+          <w:tcPr>
+            <w:tcW w:type="dxa" w:w="2376"/>
+            <w:tcMar>
+              <w:top w:w="25" w:type="dxa"/>
+              <w:bottom w:w="25" w:type="dxa"/>
+              <w:left w:w="30" w:type="dxa"/>
+              <w:right w:w="30" w:type="dxa"/>
+            </w:tcMar>
+            <w:shd w:fill="F8FAFC"/>
+          </w:tcPr>
+          <w:p>
+            <w:pPr>
+              <w:jc w:val="center"/>
+            </w:pPr>
+            <w:r>
+              <w:rPr>
+                <w:rFonts w:ascii="Consolas" w:hAnsi="Consolas"/>
+                <w:b/>
+                <w:color w:val="1E3A8A"/>
+                <w:sz w:val="16"/>
+              </w:rPr>
+              <w:t>10eb406</w:t>
+            </w:r>
+          </w:p>
+        </w:tc>
+        <w:tc>
+          <w:tcPr>
+            <w:tcW w:type="dxa" w:w="2376"/>
+            <w:tcMar>
+              <w:top w:w="25" w:type="dxa"/>
+              <w:bottom w:w="25" w:type="dxa"/>
+              <w:left w:w="30" w:type="dxa"/>
+              <w:right w:w="30" w:type="dxa"/>
+            </w:tcMar>
+            <w:shd w:fill="F8FAFC"/>
+          </w:tcPr>
+          <w:p>
+            <w:pPr>
+              <w:jc w:val="center"/>
+            </w:pPr>
+            <w:r>
+              <w:rPr>
+                <w:sz w:val="16"/>
+              </w:rPr>
+              <w:t>2026-08-18</w:t>
+            </w:r>
+          </w:p>
+        </w:tc>
+        <w:tc>
+          <w:tcPr>
+            <w:tcW w:type="dxa" w:w="2376"/>
+            <w:tcMar>
+              <w:top w:w="25" w:type="dxa"/>
+              <w:bottom w:w="25" w:type="dxa"/>
+              <w:left w:w="40" w:type="dxa"/>
+              <w:right w:w="40" w:type="dxa"/>
+            </w:tcMar>
+            <w:shd w:fill="F8FAFC"/>
+          </w:tcPr>
+          <w:p>
+            <w:pPr>
+              <w:jc w:val="center"/>
+            </w:pPr>
+            <w:r>
+              <w:rPr>
+                <w:b/>
+                <w:color w:val="059669"/>
+                <w:sz w:val="16"/>
+              </w:rPr>
+              <w:t>Fiyans Patel</w:t>
+            </w:r>
+          </w:p>
+        </w:tc>
+        <w:tc>
+          <w:tcPr>
+            <w:tcW w:type="dxa" w:w="2376"/>
+            <w:tcMar>
+              <w:top w:w="25" w:type="dxa"/>
+              <w:bottom w:w="25" w:type="dxa"/>
+              <w:left w:w="50" w:type="dxa"/>
+              <w:right w:w="50" w:type="dxa"/>
+            </w:tcMar>
+            <w:shd w:fill="F8FAFC"/>
+          </w:tcPr>
+          <w:p>
+            <w:r>
+              <w:rPr>
+                <w:sz w:val="16"/>
+              </w:rPr>
+              <w:t>feat(admin-qr): add QrMatrixBuilder for dynamic table QR URLs with high error-tolerance SVG rendering</w:t>
+            </w:r>
+          </w:p>
+        </w:tc>
+      </w:tr>
+      <w:tr>
+        <w:tc>
+          <w:tcPr>
+            <w:tcW w:type="dxa" w:w="2376"/>
+            <w:tcMar>
+              <w:top w:w="25" w:type="dxa"/>
+              <w:bottom w:w="25" w:type="dxa"/>
+              <w:left w:w="30" w:type="dxa"/>
+              <w:right w:w="30" w:type="dxa"/>
+            </w:tcMar>
+          </w:tcPr>
+          <w:p>
+            <w:pPr>
+              <w:jc w:val="center"/>
+            </w:pPr>
+            <w:r>
+              <w:rPr>
+                <w:rFonts w:ascii="Consolas" w:hAnsi="Consolas"/>
+                <w:b/>
+                <w:color w:val="1E3A8A"/>
+                <w:sz w:val="16"/>
+              </w:rPr>
+              <w:t>311cd92</w:t>
+            </w:r>
+          </w:p>
+        </w:tc>
+        <w:tc>
+          <w:tcPr>
+            <w:tcW w:type="dxa" w:w="2376"/>
+            <w:tcMar>
+              <w:top w:w="25" w:type="dxa"/>
+              <w:bottom w:w="25" w:type="dxa"/>
+              <w:left w:w="30" w:type="dxa"/>
+              <w:right w:w="30" w:type="dxa"/>
+            </w:tcMar>
+          </w:tcPr>
+          <w:p>
+            <w:pPr>
+              <w:jc w:val="center"/>
+            </w:pPr>
+            <w:r>
+              <w:rPr>
+                <w:sz w:val="16"/>
+              </w:rPr>
+              <w:t>2026-08-16</w:t>
+            </w:r>
+          </w:p>
+        </w:tc>
+        <w:tc>
+          <w:tcPr>
+            <w:tcW w:type="dxa" w:w="2376"/>
+            <w:tcMar>
+              <w:top w:w="25" w:type="dxa"/>
+              <w:bottom w:w="25" w:type="dxa"/>
+              <w:left w:w="40" w:type="dxa"/>
+              <w:right w:w="40" w:type="dxa"/>
+            </w:tcMar>
+          </w:tcPr>
+          <w:p>
+            <w:pPr>
+              <w:jc w:val="center"/>
+            </w:pPr>
+            <w:r>
+              <w:rPr>
+                <w:b/>
+                <w:color w:val="059669"/>
+                <w:sz w:val="16"/>
+              </w:rPr>
+              <w:t>Veer Prajapati</w:t>
+            </w:r>
+          </w:p>
+        </w:tc>
+        <w:tc>
+          <w:tcPr>
+            <w:tcW w:type="dxa" w:w="2376"/>
+            <w:tcMar>
+              <w:top w:w="25" w:type="dxa"/>
+              <w:bottom w:w="25" w:type="dxa"/>
+              <w:left w:w="50" w:type="dxa"/>
+              <w:right w:w="50" w:type="dxa"/>
+            </w:tcMar>
+          </w:tcPr>
+          <w:p>
+            <w:r>
+              <w:rPr>
+                <w:sz w:val="16"/>
+              </w:rPr>
+              <w:t>docs(cart-spec): add customer cart and live tracker SRS documentation with state recovery</w:t>
+            </w:r>
+          </w:p>
+        </w:tc>
+      </w:tr>
+      <w:tr>
+        <w:tc>
+          <w:tcPr>
+            <w:tcW w:type="dxa" w:w="2376"/>
+            <w:tcMar>
+              <w:top w:w="25" w:type="dxa"/>
+              <w:bottom w:w="25" w:type="dxa"/>
+              <w:left w:w="30" w:type="dxa"/>
+              <w:right w:w="30" w:type="dxa"/>
+            </w:tcMar>
+            <w:shd w:fill="F8FAFC"/>
+          </w:tcPr>
+          <w:p>
+            <w:pPr>
+              <w:jc w:val="center"/>
+            </w:pPr>
+            <w:r>
+              <w:rPr>
+                <w:rFonts w:ascii="Consolas" w:hAnsi="Consolas"/>
+                <w:b/>
+                <w:color w:val="1E3A8A"/>
+                <w:sz w:val="16"/>
+              </w:rPr>
+              <w:t>124cbc0</w:t>
+            </w:r>
+          </w:p>
+        </w:tc>
+        <w:tc>
+          <w:tcPr>
+            <w:tcW w:type="dxa" w:w="2376"/>
+            <w:tcMar>
+              <w:top w:w="25" w:type="dxa"/>
+              <w:bottom w:w="25" w:type="dxa"/>
+              <w:left w:w="30" w:type="dxa"/>
+              <w:right w:w="30" w:type="dxa"/>
+            </w:tcMar>
+            <w:shd w:fill="F8FAFC"/>
+          </w:tcPr>
+          <w:p>
+            <w:pPr>
+              <w:jc w:val="center"/>
+            </w:pPr>
+            <w:r>
+              <w:rPr>
+                <w:sz w:val="16"/>
+              </w:rPr>
+              <w:t>2026-08-15</w:t>
+            </w:r>
+          </w:p>
+        </w:tc>
+        <w:tc>
+          <w:tcPr>
+            <w:tcW w:type="dxa" w:w="2376"/>
+            <w:tcMar>
+              <w:top w:w="25" w:type="dxa"/>
+              <w:bottom w:w="25" w:type="dxa"/>
+              <w:left w:w="40" w:type="dxa"/>
+              <w:right w:w="40" w:type="dxa"/>
+            </w:tcMar>
+            <w:shd w:fill="F8FAFC"/>
+          </w:tcPr>
+          <w:p>
+            <w:pPr>
+              <w:jc w:val="center"/>
+            </w:pPr>
+            <w:r>
+              <w:rPr>
+                <w:b/>
+                <w:color w:val="059669"/>
+                <w:sz w:val="16"/>
+              </w:rPr>
+              <w:t>Veer Prajapati</w:t>
+            </w:r>
+          </w:p>
+        </w:tc>
+        <w:tc>
+          <w:tcPr>
+            <w:tcW w:type="dxa" w:w="2376"/>
+            <w:tcMar>
+              <w:top w:w="25" w:type="dxa"/>
+              <w:bottom w:w="25" w:type="dxa"/>
+              <w:left w:w="50" w:type="dxa"/>
+              <w:right w:w="50" w:type="dxa"/>
+            </w:tcMar>
+            <w:shd w:fill="F8FAFC"/>
+          </w:tcPr>
+          <w:p>
+            <w:r>
+              <w:rPr>
+                <w:sz w:val="16"/>
+              </w:rPr>
+              <w:t>feat(customer-tracker): add OrderTrackerClient for real-time KDS polling with 4.5s loop</w:t>
+            </w:r>
+          </w:p>
+        </w:tc>
+      </w:tr>
+      <w:tr>
+        <w:tc>
+          <w:tcPr>
+            <w:tcW w:type="dxa" w:w="2376"/>
+            <w:tcMar>
+              <w:top w:w="25" w:type="dxa"/>
+              <w:bottom w:w="25" w:type="dxa"/>
+              <w:left w:w="30" w:type="dxa"/>
+              <w:right w:w="30" w:type="dxa"/>
+            </w:tcMar>
+          </w:tcPr>
+          <w:p>
+            <w:pPr>
+              <w:jc w:val="center"/>
+            </w:pPr>
+            <w:r>
+              <w:rPr>
+                <w:rFonts w:ascii="Consolas" w:hAnsi="Consolas"/>
+                <w:b/>
+                <w:color w:val="1E3A8A"/>
+                <w:sz w:val="16"/>
+              </w:rPr>
+              <w:t>cf1b1c2</w:t>
+            </w:r>
+          </w:p>
+        </w:tc>
+        <w:tc>
+          <w:tcPr>
+            <w:tcW w:type="dxa" w:w="2376"/>
+            <w:tcMar>
+              <w:top w:w="25" w:type="dxa"/>
+              <w:bottom w:w="25" w:type="dxa"/>
+              <w:left w:w="30" w:type="dxa"/>
+              <w:right w:w="30" w:type="dxa"/>
+            </w:tcMar>
+          </w:tcPr>
+          <w:p>
+            <w:pPr>
+              <w:jc w:val="center"/>
+            </w:pPr>
+            <w:r>
+              <w:rPr>
+                <w:sz w:val="16"/>
+              </w:rPr>
+              <w:t>2026-10-28</w:t>
+            </w:r>
+          </w:p>
+        </w:tc>
+        <w:tc>
+          <w:tcPr>
+            <w:tcW w:type="dxa" w:w="2376"/>
+            <w:tcMar>
+              <w:top w:w="25" w:type="dxa"/>
+              <w:bottom w:w="25" w:type="dxa"/>
+              <w:left w:w="40" w:type="dxa"/>
+              <w:right w:w="40" w:type="dxa"/>
+            </w:tcMar>
+          </w:tcPr>
+          <w:p>
+            <w:pPr>
+              <w:jc w:val="center"/>
+            </w:pPr>
+            <w:r>
+              <w:rPr>
+                <w:b/>
+                <w:color w:val="1E3A8A"/>
+                <w:sz w:val="16"/>
+              </w:rPr>
+              <w:t>Shubh Patel</w:t>
+            </w:r>
+          </w:p>
+        </w:tc>
+        <w:tc>
+          <w:tcPr>
+            <w:tcW w:type="dxa" w:w="2376"/>
+            <w:tcMar>
+              <w:top w:w="25" w:type="dxa"/>
+              <w:bottom w:w="25" w:type="dxa"/>
+              <w:left w:w="50" w:type="dxa"/>
+              <w:right w:w="50" w:type="dxa"/>
+            </w:tcMar>
+          </w:tcPr>
+          <w:p>
+            <w:r>
+              <w:rPr>
+                <w:sz w:val="16"/>
+              </w:rPr>
+              <w:t>feat(customer-menu): switch default theme to Light Emerald Green matching mobile app branding</w:t>
+            </w:r>
+          </w:p>
+        </w:tc>
+      </w:tr>
+      <w:tr>
+        <w:tc>
+          <w:tcPr>
+            <w:tcW w:type="dxa" w:w="2376"/>
+            <w:tcMar>
+              <w:top w:w="25" w:type="dxa"/>
+              <w:bottom w:w="25" w:type="dxa"/>
+              <w:left w:w="30" w:type="dxa"/>
+              <w:right w:w="30" w:type="dxa"/>
+            </w:tcMar>
+            <w:shd w:fill="F8FAFC"/>
+          </w:tcPr>
+          <w:p>
+            <w:pPr>
+              <w:jc w:val="center"/>
+            </w:pPr>
+            <w:r>
+              <w:rPr>
+                <w:rFonts w:ascii="Consolas" w:hAnsi="Consolas"/>
+                <w:b/>
+                <w:color w:val="1E3A8A"/>
+                <w:sz w:val="16"/>
+              </w:rPr>
+              <w:t>201db4a</w:t>
+            </w:r>
+          </w:p>
+        </w:tc>
+        <w:tc>
+          <w:tcPr>
+            <w:tcW w:type="dxa" w:w="2376"/>
+            <w:tcMar>
+              <w:top w:w="25" w:type="dxa"/>
+              <w:bottom w:w="25" w:type="dxa"/>
+              <w:left w:w="30" w:type="dxa"/>
+              <w:right w:w="30" w:type="dxa"/>
+            </w:tcMar>
+            <w:shd w:fill="F8FAFC"/>
+          </w:tcPr>
+          <w:p>
+            <w:pPr>
+              <w:jc w:val="center"/>
+            </w:pPr>
+            <w:r>
+              <w:rPr>
+                <w:sz w:val="16"/>
+              </w:rPr>
+              <w:t>2026-10-28</w:t>
+            </w:r>
+          </w:p>
+        </w:tc>
+        <w:tc>
+          <w:tcPr>
+            <w:tcW w:type="dxa" w:w="2376"/>
+            <w:tcMar>
+              <w:top w:w="25" w:type="dxa"/>
+              <w:bottom w:w="25" w:type="dxa"/>
+              <w:left w:w="40" w:type="dxa"/>
+              <w:right w:w="40" w:type="dxa"/>
+            </w:tcMar>
+            <w:shd w:fill="F8FAFC"/>
+          </w:tcPr>
+          <w:p>
+            <w:pPr>
+              <w:jc w:val="center"/>
+            </w:pPr>
+            <w:r>
+              <w:rPr>
+                <w:b/>
+                <w:color w:val="1E3A8A"/>
+                <w:sz w:val="16"/>
+              </w:rPr>
+              <w:t>Shubh Patel</w:t>
+            </w:r>
+          </w:p>
+        </w:tc>
+        <w:tc>
+          <w:tcPr>
+            <w:tcW w:type="dxa" w:w="2376"/>
+            <w:tcMar>
+              <w:top w:w="25" w:type="dxa"/>
+              <w:bottom w:w="25" w:type="dxa"/>
+              <w:left w:w="50" w:type="dxa"/>
+              <w:right w:w="50" w:type="dxa"/>
+            </w:tcMar>
+            <w:shd w:fill="F8FAFC"/>
+          </w:tcPr>
+          <w:p>
+            <w:r>
+              <w:rPr>
+                <w:sz w:val="16"/>
+              </w:rPr>
+              <w:t>fix(deploy): add fix_db_and_500.sh script to automatically resolve MySQL credentials &amp; storage permissions</w:t>
+            </w:r>
+          </w:p>
+        </w:tc>
+      </w:tr>
+    </w:tbl>
+    <w:p>
+      <w:pPr>
+        <w:keepNext/>
+        <w:spacing w:before="180" w:after="60"/>
+      </w:pPr>
+      <w:r>
+        <w:rPr>
+          <w:rFonts w:ascii="Times New Roman" w:hAnsi="Times New Roman"/>
+          <w:b/>
+          <w:color w:val="1E3A8A"/>
+          <w:sz w:val="24"/>
+        </w:rPr>
+        <w:t>4. Project Guide &amp; Faculty Approval Sign-Off Block</w:t>
       </w:r>
     </w:p>
     <w:tbl>
@@ -215,2059 +2287,10 @@
           <w:tcPr>
             <w:tcW w:type="dxa" w:w="4752"/>
             <w:tcMar>
-              <w:top w:w="60" w:type="dxa"/>
-              <w:bottom w:w="60" w:type="dxa"/>
-              <w:left w:w="100" w:type="dxa"/>
-              <w:right w:w="100" w:type="dxa"/>
-            </w:tcMar>
-            <w:shd w:fill="F8FAFC"/>
-          </w:tcPr>
-          <w:p>
-            <w:pPr>
-              <w:spacing w:after="20"/>
-            </w:pPr>
-            <w:r>
-              <w:rPr>
-                <w:b/>
-                <w:sz w:val="20"/>
-              </w:rPr>
-              <w:t xml:space="preserve">Student Name: </w:t>
-            </w:r>
-            <w:r>
-              <w:rPr>
-                <w:sz w:val="20"/>
-              </w:rPr>
-              <w:t>PATEL SHUBH MAHESHKUMAR</w:t>
-              <w:br/>
-            </w:r>
-            <w:r>
-              <w:rPr>
-                <w:b/>
-                <w:sz w:val="20"/>
-              </w:rPr>
-              <w:t xml:space="preserve">Enrolment No: </w:t>
-            </w:r>
-            <w:r>
-              <w:rPr>
-                <w:sz w:val="20"/>
-              </w:rPr>
-              <w:t>246310307123 (Semester 5th, Batch A)</w:t>
-            </w:r>
-          </w:p>
-        </w:tc>
-        <w:tc>
-          <w:tcPr>
-            <w:tcW w:type="dxa" w:w="4752"/>
-            <w:tcMar>
-              <w:top w:w="60" w:type="dxa"/>
-              <w:bottom w:w="60" w:type="dxa"/>
-              <w:left w:w="100" w:type="dxa"/>
-              <w:right w:w="100" w:type="dxa"/>
-            </w:tcMar>
-            <w:shd w:fill="F8FAFC"/>
-          </w:tcPr>
-          <w:p>
-            <w:pPr>
-              <w:spacing w:after="20"/>
-            </w:pPr>
-            <w:r>
-              <w:rPr>
-                <w:b/>
-                <w:sz w:val="20"/>
-              </w:rPr>
-              <w:t xml:space="preserve">Project Guide: </w:t>
-            </w:r>
-            <w:r>
-              <w:rPr>
-                <w:sz w:val="20"/>
-              </w:rPr>
-              <w:t>Prof. Yagnesh Patel</w:t>
-              <w:br/>
-            </w:r>
-            <w:r>
-              <w:rPr>
-                <w:b/>
-                <w:sz w:val="20"/>
-              </w:rPr>
-              <w:t xml:space="preserve">Department: </w:t>
-            </w:r>
-            <w:r>
-              <w:rPr>
-                <w:sz w:val="20"/>
-              </w:rPr>
-              <w:t>Computer Engineering, KDP Patan</w:t>
-            </w:r>
-          </w:p>
-        </w:tc>
-      </w:tr>
-    </w:tbl>
-    <w:p>
-      <w:pPr>
-        <w:keepNext/>
-        <w:spacing w:before="200" w:after="80"/>
-      </w:pPr>
-      <w:r>
-        <w:rPr>
-          <w:rFonts w:ascii="Times New Roman" w:hAnsi="Times New Roman"/>
-          <w:b/>
-          <w:color w:val="1E3A8A"/>
-          <w:sz w:val="26"/>
-        </w:rPr>
-        <w:t>1. GitHub Repository Overview &amp; Verification Details</w:t>
-      </w:r>
-    </w:p>
-    <w:tbl>
-      <w:tblPr>
-        <w:tblW w:type="auto" w:w="0"/>
-        <w:jc w:val="center"/>
-        <w:tblLook w:firstColumn="1" w:firstRow="1" w:lastColumn="0" w:lastRow="0" w:noHBand="0" w:noVBand="1" w:val="04A0"/>
-        <w:tblBorders>
-          <w:top w:val="single" w:sz="6" w:space="0" w:color="CBD5E1"/>
-          <w:left w:val="single" w:sz="4" w:space="0" w:color="CBD5E1"/>
-          <w:bottom w:val="single" w:sz="6" w:space="0" w:color="CBD5E1"/>
-          <w:right w:val="single" w:sz="4" w:space="0" w:color="CBD5E1"/>
-          <w:insideH w:val="single" w:sz="4" w:space="0" w:color="CBD5E1"/>
-          <w:insideV w:val="single" w:sz="4" w:space="0" w:color="CBD5E1"/>
-        </w:tblBorders>
-      </w:tblPr>
-      <w:tblGrid>
-        <w:gridCol w:w="3168"/>
-        <w:gridCol w:w="6624"/>
-      </w:tblGrid>
-      <w:tr>
-        <w:tc>
-          <w:tcPr>
-            <w:tcW w:type="dxa" w:w="4752"/>
-            <w:tcMar>
-              <w:top w:w="40" w:type="dxa"/>
-              <w:bottom w:w="40" w:type="dxa"/>
+              <w:top w:w="50" w:type="dxa"/>
+              <w:bottom w:w="50" w:type="dxa"/>
               <w:left w:w="80" w:type="dxa"/>
               <w:right w:w="80" w:type="dxa"/>
-            </w:tcMar>
-          </w:tcPr>
-          <w:p>
-            <w:r>
-              <w:rPr>
-                <w:b/>
-                <w:sz w:val="19"/>
-              </w:rPr>
-              <w:t>GitHub Repository URL</w:t>
-            </w:r>
-          </w:p>
-        </w:tc>
-        <w:tc>
-          <w:tcPr>
-            <w:tcW w:type="dxa" w:w="4752"/>
-            <w:tcMar>
-              <w:top w:w="40" w:type="dxa"/>
-              <w:bottom w:w="40" w:type="dxa"/>
-              <w:left w:w="80" w:type="dxa"/>
-              <w:right w:w="80" w:type="dxa"/>
-            </w:tcMar>
-          </w:tcPr>
-          <w:p>
-            <w:r>
-              <w:rPr>
-                <w:b/>
-                <w:color w:val="1D4ED8"/>
-                <w:sz w:val="19"/>
-              </w:rPr>
-              <w:t>https://github.com/Shubh-Patel-07/DineFlow-AI</w:t>
-            </w:r>
-          </w:p>
-        </w:tc>
-      </w:tr>
-      <w:tr>
-        <w:tc>
-          <w:tcPr>
-            <w:tcW w:type="dxa" w:w="4752"/>
-            <w:tcMar>
-              <w:top w:w="40" w:type="dxa"/>
-              <w:bottom w:w="40" w:type="dxa"/>
-              <w:left w:w="80" w:type="dxa"/>
-              <w:right w:w="80" w:type="dxa"/>
-            </w:tcMar>
-            <w:shd w:fill="F8FAFC"/>
-          </w:tcPr>
-          <w:p>
-            <w:r>
-              <w:rPr>
-                <w:b/>
-                <w:sz w:val="19"/>
-              </w:rPr>
-              <w:t>Repository Owner / Account</w:t>
-            </w:r>
-          </w:p>
-        </w:tc>
-        <w:tc>
-          <w:tcPr>
-            <w:tcW w:type="dxa" w:w="4752"/>
-            <w:tcMar>
-              <w:top w:w="40" w:type="dxa"/>
-              <w:bottom w:w="40" w:type="dxa"/>
-              <w:left w:w="80" w:type="dxa"/>
-              <w:right w:w="80" w:type="dxa"/>
-            </w:tcMar>
-            <w:shd w:fill="F8FAFC"/>
-          </w:tcPr>
-          <w:p>
-            <w:r>
-              <w:rPr>
-                <w:sz w:val="19"/>
-              </w:rPr>
-              <w:t>Shubh-Patel-07 (Patel-Shubh-07)</w:t>
-            </w:r>
-          </w:p>
-        </w:tc>
-      </w:tr>
-      <w:tr>
-        <w:tc>
-          <w:tcPr>
-            <w:tcW w:type="dxa" w:w="4752"/>
-            <w:tcMar>
-              <w:top w:w="40" w:type="dxa"/>
-              <w:bottom w:w="40" w:type="dxa"/>
-              <w:left w:w="80" w:type="dxa"/>
-              <w:right w:w="80" w:type="dxa"/>
-            </w:tcMar>
-          </w:tcPr>
-          <w:p>
-            <w:r>
-              <w:rPr>
-                <w:b/>
-                <w:sz w:val="19"/>
-              </w:rPr>
-              <w:t>Visibility &amp; Access</w:t>
-            </w:r>
-          </w:p>
-        </w:tc>
-        <w:tc>
-          <w:tcPr>
-            <w:tcW w:type="dxa" w:w="4752"/>
-            <w:tcMar>
-              <w:top w:w="40" w:type="dxa"/>
-              <w:bottom w:w="40" w:type="dxa"/>
-              <w:left w:w="80" w:type="dxa"/>
-              <w:right w:w="80" w:type="dxa"/>
-            </w:tcMar>
-          </w:tcPr>
-          <w:p>
-            <w:r>
-              <w:rPr>
-                <w:sz w:val="19"/>
-              </w:rPr>
-              <w:t>Public Repository (Open for Academic &amp; Viva Verification)</w:t>
-            </w:r>
-          </w:p>
-        </w:tc>
-      </w:tr>
-      <w:tr>
-        <w:tc>
-          <w:tcPr>
-            <w:tcW w:type="dxa" w:w="4752"/>
-            <w:tcMar>
-              <w:top w:w="40" w:type="dxa"/>
-              <w:bottom w:w="40" w:type="dxa"/>
-              <w:left w:w="80" w:type="dxa"/>
-              <w:right w:w="80" w:type="dxa"/>
-            </w:tcMar>
-            <w:shd w:fill="F8FAFC"/>
-          </w:tcPr>
-          <w:p>
-            <w:r>
-              <w:rPr>
-                <w:b/>
-                <w:sz w:val="19"/>
-              </w:rPr>
-              <w:t>Primary Active Branches</w:t>
-            </w:r>
-          </w:p>
-        </w:tc>
-        <w:tc>
-          <w:tcPr>
-            <w:tcW w:type="dxa" w:w="4752"/>
-            <w:tcMar>
-              <w:top w:w="40" w:type="dxa"/>
-              <w:bottom w:w="40" w:type="dxa"/>
-              <w:left w:w="80" w:type="dxa"/>
-              <w:right w:w="80" w:type="dxa"/>
-            </w:tcMar>
-            <w:shd w:fill="F8FAFC"/>
-          </w:tcPr>
-          <w:p>
-            <w:r>
-              <w:rPr>
-                <w:sz w:val="19"/>
-              </w:rPr>
-              <w:t>main, feature-teamlead, feature/smp/react-native-app</w:t>
-            </w:r>
-          </w:p>
-        </w:tc>
-      </w:tr>
-      <w:tr>
-        <w:tc>
-          <w:tcPr>
-            <w:tcW w:type="dxa" w:w="4752"/>
-            <w:tcMar>
-              <w:top w:w="40" w:type="dxa"/>
-              <w:bottom w:w="40" w:type="dxa"/>
-              <w:left w:w="80" w:type="dxa"/>
-              <w:right w:w="80" w:type="dxa"/>
-            </w:tcMar>
-          </w:tcPr>
-          <w:p>
-            <w:r>
-              <w:rPr>
-                <w:b/>
-                <w:sz w:val="19"/>
-              </w:rPr>
-              <w:t>Live Production Server</w:t>
-            </w:r>
-          </w:p>
-        </w:tc>
-        <w:tc>
-          <w:tcPr>
-            <w:tcW w:type="dxa" w:w="4752"/>
-            <w:tcMar>
-              <w:top w:w="40" w:type="dxa"/>
-              <w:bottom w:w="40" w:type="dxa"/>
-              <w:left w:w="80" w:type="dxa"/>
-              <w:right w:w="80" w:type="dxa"/>
-            </w:tcMar>
-          </w:tcPr>
-          <w:p>
-            <w:r>
-              <w:rPr>
-                <w:b/>
-                <w:color w:val="1D4ED8"/>
-                <w:sz w:val="19"/>
-              </w:rPr>
-              <w:t>https://dineflowai.duckdns.org (AWS EC2 Cloud Instance)</w:t>
-            </w:r>
-          </w:p>
-        </w:tc>
-      </w:tr>
-      <w:tr>
-        <w:tc>
-          <w:tcPr>
-            <w:tcW w:type="dxa" w:w="4752"/>
-            <w:tcMar>
-              <w:top w:w="40" w:type="dxa"/>
-              <w:bottom w:w="40" w:type="dxa"/>
-              <w:left w:w="80" w:type="dxa"/>
-              <w:right w:w="80" w:type="dxa"/>
-            </w:tcMar>
-            <w:shd w:fill="F8FAFC"/>
-          </w:tcPr>
-          <w:p>
-            <w:r>
-              <w:rPr>
-                <w:b/>
-                <w:sz w:val="19"/>
-              </w:rPr>
-              <w:t>Core Technology Stack</w:t>
-            </w:r>
-          </w:p>
-        </w:tc>
-        <w:tc>
-          <w:tcPr>
-            <w:tcW w:type="dxa" w:w="4752"/>
-            <w:tcMar>
-              <w:top w:w="40" w:type="dxa"/>
-              <w:bottom w:w="40" w:type="dxa"/>
-              <w:left w:w="80" w:type="dxa"/>
-              <w:right w:w="80" w:type="dxa"/>
-            </w:tcMar>
-            <w:shd w:fill="F8FAFC"/>
-          </w:tcPr>
-          <w:p>
-            <w:r>
-              <w:rPr>
-                <w:sz w:val="19"/>
-              </w:rPr>
-              <w:t>Laravel 11, PHP 8.5-FPM, MySQL 8.0, React Native, Tailwind CSS, Python</w:t>
-            </w:r>
-          </w:p>
-        </w:tc>
-      </w:tr>
-    </w:tbl>
-    <w:p>
-      <w:pPr>
-        <w:keepNext/>
-        <w:spacing w:before="200" w:after="80"/>
-      </w:pPr>
-      <w:r>
-        <w:rPr>
-          <w:rFonts w:ascii="Times New Roman" w:hAnsi="Times New Roman"/>
-          <w:b/>
-          <w:color w:val="1E3A8A"/>
-          <w:sz w:val="26"/>
-        </w:rPr>
-        <w:t>2. Codebase Metrics &amp; Language Distribution</w:t>
-      </w:r>
-    </w:p>
-    <w:tbl>
-      <w:tblPr>
-        <w:tblW w:type="auto" w:w="0"/>
-        <w:jc w:val="center"/>
-        <w:tblLook w:firstColumn="1" w:firstRow="1" w:lastColumn="0" w:lastRow="0" w:noHBand="0" w:noVBand="1" w:val="04A0"/>
-        <w:tblBorders>
-          <w:top w:val="single" w:sz="6" w:space="0" w:color="CBD5E1"/>
-          <w:left w:val="single" w:sz="4" w:space="0" w:color="CBD5E1"/>
-          <w:bottom w:val="single" w:sz="6" w:space="0" w:color="CBD5E1"/>
-          <w:right w:val="single" w:sz="4" w:space="0" w:color="CBD5E1"/>
-          <w:insideH w:val="single" w:sz="4" w:space="0" w:color="CBD5E1"/>
-          <w:insideV w:val="single" w:sz="4" w:space="0" w:color="CBD5E1"/>
-        </w:tblBorders>
-      </w:tblPr>
-      <w:tblGrid>
-        <w:gridCol w:w="2592"/>
-        <w:gridCol w:w="2016"/>
-        <w:gridCol w:w="2592"/>
-        <w:gridCol w:w="2592"/>
-      </w:tblGrid>
-      <w:tr>
-        <w:tc>
-          <w:tcPr>
-            <w:tcW w:type="dxa" w:w="2376"/>
-            <w:tcMar>
-              <w:top w:w="40" w:type="dxa"/>
-              <w:bottom w:w="40" w:type="dxa"/>
-              <w:left w:w="60" w:type="dxa"/>
-              <w:right w:w="60" w:type="dxa"/>
-            </w:tcMar>
-            <w:shd w:fill="1E3A8A"/>
-          </w:tcPr>
-          <w:p>
-            <w:pPr>
-              <w:jc w:val="center"/>
-            </w:pPr>
-            <w:r>
-              <w:rPr>
-                <w:b/>
-                <w:color w:val="FFFFFF"/>
-                <w:sz w:val="19"/>
-              </w:rPr>
-              <w:t>Language / Layer</w:t>
-            </w:r>
-          </w:p>
-        </w:tc>
-        <w:tc>
-          <w:tcPr>
-            <w:tcW w:type="dxa" w:w="2376"/>
-            <w:tcMar>
-              <w:top w:w="40" w:type="dxa"/>
-              <w:bottom w:w="40" w:type="dxa"/>
-              <w:left w:w="60" w:type="dxa"/>
-              <w:right w:w="60" w:type="dxa"/>
-            </w:tcMar>
-            <w:shd w:fill="1E3A8A"/>
-          </w:tcPr>
-          <w:p>
-            <w:pPr>
-              <w:jc w:val="center"/>
-            </w:pPr>
-            <w:r>
-              <w:rPr>
-                <w:b/>
-                <w:color w:val="FFFFFF"/>
-                <w:sz w:val="19"/>
-              </w:rPr>
-              <w:t>Share (%)</w:t>
-            </w:r>
-          </w:p>
-        </w:tc>
-        <w:tc>
-          <w:tcPr>
-            <w:tcW w:type="dxa" w:w="2376"/>
-            <w:tcMar>
-              <w:top w:w="40" w:type="dxa"/>
-              <w:bottom w:w="40" w:type="dxa"/>
-              <w:left w:w="60" w:type="dxa"/>
-              <w:right w:w="60" w:type="dxa"/>
-            </w:tcMar>
-            <w:shd w:fill="1E3A8A"/>
-          </w:tcPr>
-          <w:p>
-            <w:pPr>
-              <w:jc w:val="center"/>
-            </w:pPr>
-            <w:r>
-              <w:rPr>
-                <w:b/>
-                <w:color w:val="FFFFFF"/>
-                <w:sz w:val="19"/>
-              </w:rPr>
-              <w:t>Functional Role</w:t>
-            </w:r>
-          </w:p>
-        </w:tc>
-        <w:tc>
-          <w:tcPr>
-            <w:tcW w:type="dxa" w:w="2376"/>
-            <w:tcMar>
-              <w:top w:w="40" w:type="dxa"/>
-              <w:bottom w:w="40" w:type="dxa"/>
-              <w:left w:w="60" w:type="dxa"/>
-              <w:right w:w="60" w:type="dxa"/>
-            </w:tcMar>
-            <w:shd w:fill="1E3A8A"/>
-          </w:tcPr>
-          <w:p>
-            <w:pPr>
-              <w:jc w:val="center"/>
-            </w:pPr>
-            <w:r>
-              <w:rPr>
-                <w:b/>
-                <w:color w:val="FFFFFF"/>
-                <w:sz w:val="19"/>
-              </w:rPr>
-              <w:t>Verification Status</w:t>
-            </w:r>
-          </w:p>
-        </w:tc>
-      </w:tr>
-      <w:tr>
-        <w:tc>
-          <w:tcPr>
-            <w:tcW w:type="dxa" w:w="2376"/>
-            <w:tcMar>
-              <w:top w:w="35" w:type="dxa"/>
-              <w:bottom w:w="35" w:type="dxa"/>
-              <w:left w:w="60" w:type="dxa"/>
-              <w:right w:w="60" w:type="dxa"/>
-            </w:tcMar>
-          </w:tcPr>
-          <w:p>
-            <w:pPr>
-              <w:jc w:val="left"/>
-            </w:pPr>
-            <w:r>
-              <w:rPr>
-                <w:b/>
-                <w:sz w:val="18"/>
-              </w:rPr>
-              <w:t>PHP / Laravel 11</w:t>
-            </w:r>
-          </w:p>
-        </w:tc>
-        <w:tc>
-          <w:tcPr>
-            <w:tcW w:type="dxa" w:w="2376"/>
-            <w:tcMar>
-              <w:top w:w="35" w:type="dxa"/>
-              <w:bottom w:w="35" w:type="dxa"/>
-              <w:left w:w="60" w:type="dxa"/>
-              <w:right w:w="60" w:type="dxa"/>
-            </w:tcMar>
-          </w:tcPr>
-          <w:p>
-            <w:pPr>
-              <w:jc w:val="center"/>
-            </w:pPr>
-            <w:r>
-              <w:rPr>
-                <w:sz w:val="18"/>
-              </w:rPr>
-              <w:t>48.5%</w:t>
-            </w:r>
-          </w:p>
-        </w:tc>
-        <w:tc>
-          <w:tcPr>
-            <w:tcW w:type="dxa" w:w="2376"/>
-            <w:tcMar>
-              <w:top w:w="35" w:type="dxa"/>
-              <w:bottom w:w="35" w:type="dxa"/>
-              <w:left w:w="60" w:type="dxa"/>
-              <w:right w:w="60" w:type="dxa"/>
-            </w:tcMar>
-          </w:tcPr>
-          <w:p>
-            <w:pPr>
-              <w:jc w:val="left"/>
-            </w:pPr>
-            <w:r>
-              <w:rPr>
-                <w:sz w:val="18"/>
-              </w:rPr>
-              <w:t>REST API, Eloquent ORM, Auth &amp; BOM Logic</w:t>
-            </w:r>
-          </w:p>
-        </w:tc>
-        <w:tc>
-          <w:tcPr>
-            <w:tcW w:type="dxa" w:w="2376"/>
-            <w:tcMar>
-              <w:top w:w="35" w:type="dxa"/>
-              <w:bottom w:w="35" w:type="dxa"/>
-              <w:left w:w="60" w:type="dxa"/>
-              <w:right w:w="60" w:type="dxa"/>
-            </w:tcMar>
-          </w:tcPr>
-          <w:p>
-            <w:pPr>
-              <w:jc w:val="center"/>
-            </w:pPr>
-            <w:r>
-              <w:rPr>
-                <w:b/>
-                <w:color w:val="059669"/>
-                <w:sz w:val="18"/>
-              </w:rPr>
-              <w:t>100% Tested (PHPUnit)</w:t>
-            </w:r>
-          </w:p>
-        </w:tc>
-      </w:tr>
-      <w:tr>
-        <w:tc>
-          <w:tcPr>
-            <w:tcW w:type="dxa" w:w="2376"/>
-            <w:tcMar>
-              <w:top w:w="35" w:type="dxa"/>
-              <w:bottom w:w="35" w:type="dxa"/>
-              <w:left w:w="60" w:type="dxa"/>
-              <w:right w:w="60" w:type="dxa"/>
-            </w:tcMar>
-            <w:shd w:fill="F8FAFC"/>
-          </w:tcPr>
-          <w:p>
-            <w:pPr>
-              <w:jc w:val="left"/>
-            </w:pPr>
-            <w:r>
-              <w:rPr>
-                <w:b/>
-                <w:sz w:val="18"/>
-              </w:rPr>
-              <w:t>JavaScript (ES6+) / React</w:t>
-            </w:r>
-          </w:p>
-        </w:tc>
-        <w:tc>
-          <w:tcPr>
-            <w:tcW w:type="dxa" w:w="2376"/>
-            <w:tcMar>
-              <w:top w:w="35" w:type="dxa"/>
-              <w:bottom w:w="35" w:type="dxa"/>
-              <w:left w:w="60" w:type="dxa"/>
-              <w:right w:w="60" w:type="dxa"/>
-            </w:tcMar>
-            <w:shd w:fill="F8FAFC"/>
-          </w:tcPr>
-          <w:p>
-            <w:pPr>
-              <w:jc w:val="center"/>
-            </w:pPr>
-            <w:r>
-              <w:rPr>
-                <w:sz w:val="18"/>
-              </w:rPr>
-              <w:t>28.2%</w:t>
-            </w:r>
-          </w:p>
-        </w:tc>
-        <w:tc>
-          <w:tcPr>
-            <w:tcW w:type="dxa" w:w="2376"/>
-            <w:tcMar>
-              <w:top w:w="35" w:type="dxa"/>
-              <w:bottom w:w="35" w:type="dxa"/>
-              <w:left w:w="60" w:type="dxa"/>
-              <w:right w:w="60" w:type="dxa"/>
-            </w:tcMar>
-            <w:shd w:fill="F8FAFC"/>
-          </w:tcPr>
-          <w:p>
-            <w:pPr>
-              <w:jc w:val="left"/>
-            </w:pPr>
-            <w:r>
-              <w:rPr>
-                <w:sz w:val="18"/>
-              </w:rPr>
-              <w:t>Cashier Web POS &amp; React Native Mobile App</w:t>
-            </w:r>
-          </w:p>
-        </w:tc>
-        <w:tc>
-          <w:tcPr>
-            <w:tcW w:type="dxa" w:w="2376"/>
-            <w:tcMar>
-              <w:top w:w="35" w:type="dxa"/>
-              <w:bottom w:w="35" w:type="dxa"/>
-              <w:left w:w="60" w:type="dxa"/>
-              <w:right w:w="60" w:type="dxa"/>
-            </w:tcMar>
-            <w:shd w:fill="F8FAFC"/>
-          </w:tcPr>
-          <w:p>
-            <w:pPr>
-              <w:jc w:val="center"/>
-            </w:pPr>
-            <w:r>
-              <w:rPr>
-                <w:b/>
-                <w:color w:val="059669"/>
-                <w:sz w:val="18"/>
-              </w:rPr>
-              <w:t>Sub-18ms DOM Latency</w:t>
-            </w:r>
-          </w:p>
-        </w:tc>
-      </w:tr>
-      <w:tr>
-        <w:tc>
-          <w:tcPr>
-            <w:tcW w:type="dxa" w:w="2376"/>
-            <w:tcMar>
-              <w:top w:w="35" w:type="dxa"/>
-              <w:bottom w:w="35" w:type="dxa"/>
-              <w:left w:w="60" w:type="dxa"/>
-              <w:right w:w="60" w:type="dxa"/>
-            </w:tcMar>
-          </w:tcPr>
-          <w:p>
-            <w:pPr>
-              <w:jc w:val="left"/>
-            </w:pPr>
-            <w:r>
-              <w:rPr>
-                <w:b/>
-                <w:sz w:val="18"/>
-              </w:rPr>
-              <w:t>CSS3 / Tailwind CSS</w:t>
-            </w:r>
-          </w:p>
-        </w:tc>
-        <w:tc>
-          <w:tcPr>
-            <w:tcW w:type="dxa" w:w="2376"/>
-            <w:tcMar>
-              <w:top w:w="35" w:type="dxa"/>
-              <w:bottom w:w="35" w:type="dxa"/>
-              <w:left w:w="60" w:type="dxa"/>
-              <w:right w:w="60" w:type="dxa"/>
-            </w:tcMar>
-          </w:tcPr>
-          <w:p>
-            <w:pPr>
-              <w:jc w:val="center"/>
-            </w:pPr>
-            <w:r>
-              <w:rPr>
-                <w:sz w:val="18"/>
-              </w:rPr>
-              <w:t>12.4%</w:t>
-            </w:r>
-          </w:p>
-        </w:tc>
-        <w:tc>
-          <w:tcPr>
-            <w:tcW w:type="dxa" w:w="2376"/>
-            <w:tcMar>
-              <w:top w:w="35" w:type="dxa"/>
-              <w:bottom w:w="35" w:type="dxa"/>
-              <w:left w:w="60" w:type="dxa"/>
-              <w:right w:w="60" w:type="dxa"/>
-            </w:tcMar>
-          </w:tcPr>
-          <w:p>
-            <w:pPr>
-              <w:jc w:val="left"/>
-            </w:pPr>
-            <w:r>
-              <w:rPr>
-                <w:sz w:val="18"/>
-              </w:rPr>
-              <w:t>Responsive Themes (Light Emerald Green)</w:t>
-            </w:r>
-          </w:p>
-        </w:tc>
-        <w:tc>
-          <w:tcPr>
-            <w:tcW w:type="dxa" w:w="2376"/>
-            <w:tcMar>
-              <w:top w:w="35" w:type="dxa"/>
-              <w:bottom w:w="35" w:type="dxa"/>
-              <w:left w:w="60" w:type="dxa"/>
-              <w:right w:w="60" w:type="dxa"/>
-            </w:tcMar>
-          </w:tcPr>
-          <w:p>
-            <w:pPr>
-              <w:jc w:val="center"/>
-            </w:pPr>
-            <w:r>
-              <w:rPr>
-                <w:b/>
-                <w:color w:val="059669"/>
-                <w:sz w:val="18"/>
-              </w:rPr>
-              <w:t>High Sunlight Contrast</w:t>
-            </w:r>
-          </w:p>
-        </w:tc>
-      </w:tr>
-      <w:tr>
-        <w:tc>
-          <w:tcPr>
-            <w:tcW w:type="dxa" w:w="2376"/>
-            <w:tcMar>
-              <w:top w:w="35" w:type="dxa"/>
-              <w:bottom w:w="35" w:type="dxa"/>
-              <w:left w:w="60" w:type="dxa"/>
-              <w:right w:w="60" w:type="dxa"/>
-            </w:tcMar>
-            <w:shd w:fill="F8FAFC"/>
-          </w:tcPr>
-          <w:p>
-            <w:pPr>
-              <w:jc w:val="left"/>
-            </w:pPr>
-            <w:r>
-              <w:rPr>
-                <w:b/>
-                <w:sz w:val="18"/>
-              </w:rPr>
-              <w:t>HTML5 / Blade / Python</w:t>
-            </w:r>
-          </w:p>
-        </w:tc>
-        <w:tc>
-          <w:tcPr>
-            <w:tcW w:type="dxa" w:w="2376"/>
-            <w:tcMar>
-              <w:top w:w="35" w:type="dxa"/>
-              <w:bottom w:w="35" w:type="dxa"/>
-              <w:left w:w="60" w:type="dxa"/>
-              <w:right w:w="60" w:type="dxa"/>
-            </w:tcMar>
-            <w:shd w:fill="F8FAFC"/>
-          </w:tcPr>
-          <w:p>
-            <w:pPr>
-              <w:jc w:val="center"/>
-            </w:pPr>
-            <w:r>
-              <w:rPr>
-                <w:sz w:val="18"/>
-              </w:rPr>
-              <w:t>10.9%</w:t>
-            </w:r>
-          </w:p>
-        </w:tc>
-        <w:tc>
-          <w:tcPr>
-            <w:tcW w:type="dxa" w:w="2376"/>
-            <w:tcMar>
-              <w:top w:w="35" w:type="dxa"/>
-              <w:bottom w:w="35" w:type="dxa"/>
-              <w:left w:w="60" w:type="dxa"/>
-              <w:right w:w="60" w:type="dxa"/>
-            </w:tcMar>
-            <w:shd w:fill="F8FAFC"/>
-          </w:tcPr>
-          <w:p>
-            <w:pPr>
-              <w:jc w:val="left"/>
-            </w:pPr>
-            <w:r>
-              <w:rPr>
-                <w:sz w:val="18"/>
-              </w:rPr>
-              <w:t>PWA Layouts, Diagrams &amp; Benchmarks</w:t>
-            </w:r>
-          </w:p>
-        </w:tc>
-        <w:tc>
-          <w:tcPr>
-            <w:tcW w:type="dxa" w:w="2376"/>
-            <w:tcMar>
-              <w:top w:w="35" w:type="dxa"/>
-              <w:bottom w:w="35" w:type="dxa"/>
-              <w:left w:w="60" w:type="dxa"/>
-              <w:right w:w="60" w:type="dxa"/>
-            </w:tcMar>
-            <w:shd w:fill="F8FAFC"/>
-          </w:tcPr>
-          <w:p>
-            <w:pPr>
-              <w:jc w:val="center"/>
-            </w:pPr>
-            <w:r>
-              <w:rPr>
-                <w:b/>
-                <w:color w:val="059669"/>
-                <w:sz w:val="18"/>
-              </w:rPr>
-              <w:t>Verified Validated W3C</w:t>
-            </w:r>
-          </w:p>
-        </w:tc>
-      </w:tr>
-    </w:tbl>
-    <w:p>
-      <w:r>
-        <w:br w:type="page"/>
-      </w:r>
-    </w:p>
-    <w:p>
-      <w:pPr>
-        <w:keepNext/>
-        <w:spacing w:before="200" w:after="80"/>
-      </w:pPr>
-      <w:r>
-        <w:rPr>
-          <w:rFonts w:ascii="Times New Roman" w:hAnsi="Times New Roman"/>
-          <w:b/>
-          <w:color w:val="1E3A8A"/>
-          <w:sz w:val="26"/>
-        </w:rPr>
-        <w:t>3. Verified Chronological Git Commit Activity Log (Weeks 1 to 15)</w:t>
-      </w:r>
-    </w:p>
-    <w:tbl>
-      <w:tblPr>
-        <w:tblW w:type="auto" w:w="0"/>
-        <w:jc w:val="center"/>
-        <w:tblLook w:firstColumn="1" w:firstRow="1" w:lastColumn="0" w:lastRow="0" w:noHBand="0" w:noVBand="1" w:val="04A0"/>
-        <w:tblBorders>
-          <w:top w:val="single" w:sz="6" w:space="0" w:color="CBD5E1"/>
-          <w:left w:val="single" w:sz="4" w:space="0" w:color="CBD5E1"/>
-          <w:bottom w:val="single" w:sz="6" w:space="0" w:color="CBD5E1"/>
-          <w:right w:val="single" w:sz="4" w:space="0" w:color="CBD5E1"/>
-          <w:insideH w:val="single" w:sz="4" w:space="0" w:color="CBD5E1"/>
-          <w:insideV w:val="single" w:sz="4" w:space="0" w:color="CBD5E1"/>
-        </w:tblBorders>
-      </w:tblPr>
-      <w:tblGrid>
-        <w:gridCol w:w="1296"/>
-        <w:gridCol w:w="1584"/>
-        <w:gridCol w:w="2016"/>
-        <w:gridCol w:w="4896"/>
-      </w:tblGrid>
-      <w:tr>
-        <w:tc>
-          <w:tcPr>
-            <w:tcW w:type="dxa" w:w="2376"/>
-            <w:tcMar>
-              <w:top w:w="40" w:type="dxa"/>
-              <w:bottom w:w="40" w:type="dxa"/>
-              <w:left w:w="60" w:type="dxa"/>
-              <w:right w:w="60" w:type="dxa"/>
-            </w:tcMar>
-            <w:shd w:fill="1E3A8A"/>
-          </w:tcPr>
-          <w:p>
-            <w:pPr>
-              <w:jc w:val="center"/>
-            </w:pPr>
-            <w:r>
-              <w:rPr>
-                <w:b/>
-                <w:color w:val="FFFFFF"/>
-                <w:sz w:val="19"/>
-              </w:rPr>
-              <w:t>Commit SHA</w:t>
-            </w:r>
-          </w:p>
-        </w:tc>
-        <w:tc>
-          <w:tcPr>
-            <w:tcW w:type="dxa" w:w="2376"/>
-            <w:tcMar>
-              <w:top w:w="40" w:type="dxa"/>
-              <w:bottom w:w="40" w:type="dxa"/>
-              <w:left w:w="60" w:type="dxa"/>
-              <w:right w:w="60" w:type="dxa"/>
-            </w:tcMar>
-            <w:shd w:fill="1E3A8A"/>
-          </w:tcPr>
-          <w:p>
-            <w:pPr>
-              <w:jc w:val="center"/>
-            </w:pPr>
-            <w:r>
-              <w:rPr>
-                <w:b/>
-                <w:color w:val="FFFFFF"/>
-                <w:sz w:val="19"/>
-              </w:rPr>
-              <w:t>Commit Date</w:t>
-            </w:r>
-          </w:p>
-        </w:tc>
-        <w:tc>
-          <w:tcPr>
-            <w:tcW w:type="dxa" w:w="2376"/>
-            <w:tcMar>
-              <w:top w:w="40" w:type="dxa"/>
-              <w:bottom w:w="40" w:type="dxa"/>
-              <w:left w:w="60" w:type="dxa"/>
-              <w:right w:w="60" w:type="dxa"/>
-            </w:tcMar>
-            <w:shd w:fill="1E3A8A"/>
-          </w:tcPr>
-          <w:p>
-            <w:pPr>
-              <w:jc w:val="center"/>
-            </w:pPr>
-            <w:r>
-              <w:rPr>
-                <w:b/>
-                <w:color w:val="FFFFFF"/>
-                <w:sz w:val="19"/>
-              </w:rPr>
-              <w:t>Curriculum Phase</w:t>
-            </w:r>
-          </w:p>
-        </w:tc>
-        <w:tc>
-          <w:tcPr>
-            <w:tcW w:type="dxa" w:w="2376"/>
-            <w:tcMar>
-              <w:top w:w="40" w:type="dxa"/>
-              <w:bottom w:w="40" w:type="dxa"/>
-              <w:left w:w="60" w:type="dxa"/>
-              <w:right w:w="60" w:type="dxa"/>
-            </w:tcMar>
-            <w:shd w:fill="1E3A8A"/>
-          </w:tcPr>
-          <w:p>
-            <w:pPr>
-              <w:jc w:val="center"/>
-            </w:pPr>
-            <w:r>
-              <w:rPr>
-                <w:b/>
-                <w:color w:val="FFFFFF"/>
-                <w:sz w:val="19"/>
-              </w:rPr>
-              <w:t>Commit Summary &amp; Verified Engineering Deliverable</w:t>
-            </w:r>
-          </w:p>
-        </w:tc>
-      </w:tr>
-      <w:tr>
-        <w:tc>
-          <w:tcPr>
-            <w:tcW w:type="dxa" w:w="2376"/>
-            <w:tcMar>
-              <w:top w:w="30" w:type="dxa"/>
-              <w:bottom w:w="30" w:type="dxa"/>
-              <w:left w:w="40" w:type="dxa"/>
-              <w:right w:w="40" w:type="dxa"/>
-            </w:tcMar>
-          </w:tcPr>
-          <w:p>
-            <w:pPr>
-              <w:jc w:val="center"/>
-            </w:pPr>
-            <w:r>
-              <w:rPr>
-                <w:rFonts w:ascii="Consolas" w:hAnsi="Consolas"/>
-                <w:b/>
-                <w:color w:val="1E3A8A"/>
-                <w:sz w:val="17"/>
-              </w:rPr>
-              <w:t>749c654</w:t>
-            </w:r>
-          </w:p>
-        </w:tc>
-        <w:tc>
-          <w:tcPr>
-            <w:tcW w:type="dxa" w:w="2376"/>
-            <w:tcMar>
-              <w:top w:w="30" w:type="dxa"/>
-              <w:bottom w:w="30" w:type="dxa"/>
-              <w:left w:w="40" w:type="dxa"/>
-              <w:right w:w="40" w:type="dxa"/>
-            </w:tcMar>
-          </w:tcPr>
-          <w:p>
-            <w:pPr>
-              <w:jc w:val="center"/>
-            </w:pPr>
-            <w:r>
-              <w:rPr>
-                <w:sz w:val="17"/>
-              </w:rPr>
-              <w:t>2026-10-28</w:t>
-            </w:r>
-          </w:p>
-        </w:tc>
-        <w:tc>
-          <w:tcPr>
-            <w:tcW w:type="dxa" w:w="2376"/>
-            <w:tcMar>
-              <w:top w:w="30" w:type="dxa"/>
-              <w:bottom w:w="30" w:type="dxa"/>
-              <w:left w:w="40" w:type="dxa"/>
-              <w:right w:w="40" w:type="dxa"/>
-            </w:tcMar>
-          </w:tcPr>
-          <w:p>
-            <w:pPr>
-              <w:jc w:val="center"/>
-            </w:pPr>
-            <w:r>
-              <w:rPr>
-                <w:b/>
-                <w:color w:val="475569"/>
-                <w:sz w:val="17"/>
-              </w:rPr>
-              <w:t>Final Viva Prep</w:t>
-            </w:r>
-          </w:p>
-        </w:tc>
-        <w:tc>
-          <w:tcPr>
-            <w:tcW w:type="dxa" w:w="2376"/>
-            <w:tcMar>
-              <w:top w:w="30" w:type="dxa"/>
-              <w:bottom w:w="30" w:type="dxa"/>
-              <w:left w:w="60" w:type="dxa"/>
-              <w:right w:w="60" w:type="dxa"/>
-            </w:tcMar>
-          </w:tcPr>
-          <w:p>
-            <w:r>
-              <w:rPr>
-                <w:sz w:val="17"/>
-              </w:rPr>
-              <w:t>docs(gtu): align Slide 3 industry stats and Slide 11 4-stage build sequence with GTU demo PPT template</w:t>
-            </w:r>
-          </w:p>
-        </w:tc>
-      </w:tr>
-      <w:tr>
-        <w:tc>
-          <w:tcPr>
-            <w:tcW w:type="dxa" w:w="2376"/>
-            <w:tcMar>
-              <w:top w:w="30" w:type="dxa"/>
-              <w:bottom w:w="30" w:type="dxa"/>
-              <w:left w:w="40" w:type="dxa"/>
-              <w:right w:w="40" w:type="dxa"/>
-            </w:tcMar>
-            <w:shd w:fill="F8FAFC"/>
-          </w:tcPr>
-          <w:p>
-            <w:pPr>
-              <w:jc w:val="center"/>
-            </w:pPr>
-            <w:r>
-              <w:rPr>
-                <w:rFonts w:ascii="Consolas" w:hAnsi="Consolas"/>
-                <w:b/>
-                <w:color w:val="1E3A8A"/>
-                <w:sz w:val="17"/>
-              </w:rPr>
-              <w:t>132c046</w:t>
-            </w:r>
-          </w:p>
-        </w:tc>
-        <w:tc>
-          <w:tcPr>
-            <w:tcW w:type="dxa" w:w="2376"/>
-            <w:tcMar>
-              <w:top w:w="30" w:type="dxa"/>
-              <w:bottom w:w="30" w:type="dxa"/>
-              <w:left w:w="40" w:type="dxa"/>
-              <w:right w:w="40" w:type="dxa"/>
-            </w:tcMar>
-            <w:shd w:fill="F8FAFC"/>
-          </w:tcPr>
-          <w:p>
-            <w:pPr>
-              <w:jc w:val="center"/>
-            </w:pPr>
-            <w:r>
-              <w:rPr>
-                <w:sz w:val="17"/>
-              </w:rPr>
-              <w:t>2026-10-28</w:t>
-            </w:r>
-          </w:p>
-        </w:tc>
-        <w:tc>
-          <w:tcPr>
-            <w:tcW w:type="dxa" w:w="2376"/>
-            <w:tcMar>
-              <w:top w:w="30" w:type="dxa"/>
-              <w:bottom w:w="30" w:type="dxa"/>
-              <w:left w:w="40" w:type="dxa"/>
-              <w:right w:w="40" w:type="dxa"/>
-            </w:tcMar>
-            <w:shd w:fill="F8FAFC"/>
-          </w:tcPr>
-          <w:p>
-            <w:pPr>
-              <w:jc w:val="center"/>
-            </w:pPr>
-            <w:r>
-              <w:rPr>
-                <w:b/>
-                <w:color w:val="475569"/>
-                <w:sz w:val="17"/>
-              </w:rPr>
-              <w:t>Final Viva Prep</w:t>
-            </w:r>
-          </w:p>
-        </w:tc>
-        <w:tc>
-          <w:tcPr>
-            <w:tcW w:type="dxa" w:w="2376"/>
-            <w:tcMar>
-              <w:top w:w="30" w:type="dxa"/>
-              <w:bottom w:w="30" w:type="dxa"/>
-              <w:left w:w="60" w:type="dxa"/>
-              <w:right w:w="60" w:type="dxa"/>
-            </w:tcMar>
-            <w:shd w:fill="F8FAFC"/>
-          </w:tcPr>
-          <w:p>
-            <w:r>
-              <w:rPr>
-                <w:sz w:val="17"/>
-              </w:rPr>
-              <w:t>docs(gtu): remove BOM section, format algorithms in formal CS boxes, convert presentation to 100% light theme (17 slides)</w:t>
-            </w:r>
-          </w:p>
-        </w:tc>
-      </w:tr>
-      <w:tr>
-        <w:tc>
-          <w:tcPr>
-            <w:tcW w:type="dxa" w:w="2376"/>
-            <w:tcMar>
-              <w:top w:w="30" w:type="dxa"/>
-              <w:bottom w:w="30" w:type="dxa"/>
-              <w:left w:w="40" w:type="dxa"/>
-              <w:right w:w="40" w:type="dxa"/>
-            </w:tcMar>
-          </w:tcPr>
-          <w:p>
-            <w:pPr>
-              <w:jc w:val="center"/>
-            </w:pPr>
-            <w:r>
-              <w:rPr>
-                <w:rFonts w:ascii="Consolas" w:hAnsi="Consolas"/>
-                <w:b/>
-                <w:color w:val="1E3A8A"/>
-                <w:sz w:val="17"/>
-              </w:rPr>
-              <w:t>b338628</w:t>
-            </w:r>
-          </w:p>
-        </w:tc>
-        <w:tc>
-          <w:tcPr>
-            <w:tcW w:type="dxa" w:w="2376"/>
-            <w:tcMar>
-              <w:top w:w="30" w:type="dxa"/>
-              <w:bottom w:w="30" w:type="dxa"/>
-              <w:left w:w="40" w:type="dxa"/>
-              <w:right w:w="40" w:type="dxa"/>
-            </w:tcMar>
-          </w:tcPr>
-          <w:p>
-            <w:pPr>
-              <w:jc w:val="center"/>
-            </w:pPr>
-            <w:r>
-              <w:rPr>
-                <w:sz w:val="17"/>
-              </w:rPr>
-              <w:t>2026-10-28</w:t>
-            </w:r>
-          </w:p>
-        </w:tc>
-        <w:tc>
-          <w:tcPr>
-            <w:tcW w:type="dxa" w:w="2376"/>
-            <w:tcMar>
-              <w:top w:w="30" w:type="dxa"/>
-              <w:bottom w:w="30" w:type="dxa"/>
-              <w:left w:w="40" w:type="dxa"/>
-              <w:right w:w="40" w:type="dxa"/>
-            </w:tcMar>
-          </w:tcPr>
-          <w:p>
-            <w:pPr>
-              <w:jc w:val="center"/>
-            </w:pPr>
-            <w:r>
-              <w:rPr>
-                <w:b/>
-                <w:color w:val="475569"/>
-                <w:sz w:val="17"/>
-              </w:rPr>
-              <w:t>Documentation</w:t>
-            </w:r>
-          </w:p>
-        </w:tc>
-        <w:tc>
-          <w:tcPr>
-            <w:tcW w:type="dxa" w:w="2376"/>
-            <w:tcMar>
-              <w:top w:w="30" w:type="dxa"/>
-              <w:bottom w:w="30" w:type="dxa"/>
-              <w:left w:w="60" w:type="dxa"/>
-              <w:right w:w="60" w:type="dxa"/>
-            </w:tcMar>
-          </w:tcPr>
-          <w:p>
-            <w:r>
-              <w:rPr>
-                <w:sz w:val="17"/>
-              </w:rPr>
-              <w:t>docs(gtu): finalize 18-slide PPTX, 8-chapter DOCX report with embedded block/circuit/flowchart diagrams &amp; GTU Competency 15</w:t>
-            </w:r>
-          </w:p>
-        </w:tc>
-      </w:tr>
-      <w:tr>
-        <w:tc>
-          <w:tcPr>
-            <w:tcW w:type="dxa" w:w="2376"/>
-            <w:tcMar>
-              <w:top w:w="30" w:type="dxa"/>
-              <w:bottom w:w="30" w:type="dxa"/>
-              <w:left w:w="40" w:type="dxa"/>
-              <w:right w:w="40" w:type="dxa"/>
-            </w:tcMar>
-            <w:shd w:fill="F8FAFC"/>
-          </w:tcPr>
-          <w:p>
-            <w:pPr>
-              <w:jc w:val="center"/>
-            </w:pPr>
-            <w:r>
-              <w:rPr>
-                <w:rFonts w:ascii="Consolas" w:hAnsi="Consolas"/>
-                <w:b/>
-                <w:color w:val="1E3A8A"/>
-                <w:sz w:val="17"/>
-              </w:rPr>
-              <w:t>cf1b1c2</w:t>
-            </w:r>
-          </w:p>
-        </w:tc>
-        <w:tc>
-          <w:tcPr>
-            <w:tcW w:type="dxa" w:w="2376"/>
-            <w:tcMar>
-              <w:top w:w="30" w:type="dxa"/>
-              <w:bottom w:w="30" w:type="dxa"/>
-              <w:left w:w="40" w:type="dxa"/>
-              <w:right w:w="40" w:type="dxa"/>
-            </w:tcMar>
-            <w:shd w:fill="F8FAFC"/>
-          </w:tcPr>
-          <w:p>
-            <w:pPr>
-              <w:jc w:val="center"/>
-            </w:pPr>
-            <w:r>
-              <w:rPr>
-                <w:sz w:val="17"/>
-              </w:rPr>
-              <w:t>2026-10-28</w:t>
-            </w:r>
-          </w:p>
-        </w:tc>
-        <w:tc>
-          <w:tcPr>
-            <w:tcW w:type="dxa" w:w="2376"/>
-            <w:tcMar>
-              <w:top w:w="30" w:type="dxa"/>
-              <w:bottom w:w="30" w:type="dxa"/>
-              <w:left w:w="40" w:type="dxa"/>
-              <w:right w:w="40" w:type="dxa"/>
-            </w:tcMar>
-            <w:shd w:fill="F8FAFC"/>
-          </w:tcPr>
-          <w:p>
-            <w:pPr>
-              <w:jc w:val="center"/>
-            </w:pPr>
-            <w:r>
-              <w:rPr>
-                <w:b/>
-                <w:color w:val="475569"/>
-                <w:sz w:val="17"/>
-              </w:rPr>
-              <w:t>UI Hardening</w:t>
-            </w:r>
-          </w:p>
-        </w:tc>
-        <w:tc>
-          <w:tcPr>
-            <w:tcW w:type="dxa" w:w="2376"/>
-            <w:tcMar>
-              <w:top w:w="30" w:type="dxa"/>
-              <w:bottom w:w="30" w:type="dxa"/>
-              <w:left w:w="60" w:type="dxa"/>
-              <w:right w:w="60" w:type="dxa"/>
-            </w:tcMar>
-            <w:shd w:fill="F8FAFC"/>
-          </w:tcPr>
-          <w:p>
-            <w:r>
-              <w:rPr>
-                <w:sz w:val="17"/>
-              </w:rPr>
-              <w:t>feat(customer-menu): switch default theme to Light Emerald Green matching mobile app branding</w:t>
-            </w:r>
-          </w:p>
-        </w:tc>
-      </w:tr>
-      <w:tr>
-        <w:tc>
-          <w:tcPr>
-            <w:tcW w:type="dxa" w:w="2376"/>
-            <w:tcMar>
-              <w:top w:w="30" w:type="dxa"/>
-              <w:bottom w:w="30" w:type="dxa"/>
-              <w:left w:w="40" w:type="dxa"/>
-              <w:right w:w="40" w:type="dxa"/>
-            </w:tcMar>
-          </w:tcPr>
-          <w:p>
-            <w:pPr>
-              <w:jc w:val="center"/>
-            </w:pPr>
-            <w:r>
-              <w:rPr>
-                <w:rFonts w:ascii="Consolas" w:hAnsi="Consolas"/>
-                <w:b/>
-                <w:color w:val="1E3A8A"/>
-                <w:sz w:val="17"/>
-              </w:rPr>
-              <w:t>cae3bbd</w:t>
-            </w:r>
-          </w:p>
-        </w:tc>
-        <w:tc>
-          <w:tcPr>
-            <w:tcW w:type="dxa" w:w="2376"/>
-            <w:tcMar>
-              <w:top w:w="30" w:type="dxa"/>
-              <w:bottom w:w="30" w:type="dxa"/>
-              <w:left w:w="40" w:type="dxa"/>
-              <w:right w:w="40" w:type="dxa"/>
-            </w:tcMar>
-          </w:tcPr>
-          <w:p>
-            <w:pPr>
-              <w:jc w:val="center"/>
-            </w:pPr>
-            <w:r>
-              <w:rPr>
-                <w:sz w:val="17"/>
-              </w:rPr>
-              <w:t>2026-10-28</w:t>
-            </w:r>
-          </w:p>
-        </w:tc>
-        <w:tc>
-          <w:tcPr>
-            <w:tcW w:type="dxa" w:w="2376"/>
-            <w:tcMar>
-              <w:top w:w="30" w:type="dxa"/>
-              <w:bottom w:w="30" w:type="dxa"/>
-              <w:left w:w="40" w:type="dxa"/>
-              <w:right w:w="40" w:type="dxa"/>
-            </w:tcMar>
-          </w:tcPr>
-          <w:p>
-            <w:pPr>
-              <w:jc w:val="center"/>
-            </w:pPr>
-            <w:r>
-              <w:rPr>
-                <w:b/>
-                <w:color w:val="475569"/>
-                <w:sz w:val="17"/>
-              </w:rPr>
-              <w:t>Mobile Build</w:t>
-            </w:r>
-          </w:p>
-        </w:tc>
-        <w:tc>
-          <w:tcPr>
-            <w:tcW w:type="dxa" w:w="2376"/>
-            <w:tcMar>
-              <w:top w:w="30" w:type="dxa"/>
-              <w:bottom w:w="30" w:type="dxa"/>
-              <w:left w:w="60" w:type="dxa"/>
-              <w:right w:w="60" w:type="dxa"/>
-            </w:tcMar>
-          </w:tcPr>
-          <w:p>
-            <w:r>
-              <w:rPr>
-                <w:sz w:val="17"/>
-              </w:rPr>
-              <w:t>feat(mobile-web): rebuild web export with InteractionManager polyfill and font fallback support</w:t>
-            </w:r>
-          </w:p>
-        </w:tc>
-      </w:tr>
-      <w:tr>
-        <w:tc>
-          <w:tcPr>
-            <w:tcW w:type="dxa" w:w="2376"/>
-            <w:tcMar>
-              <w:top w:w="30" w:type="dxa"/>
-              <w:bottom w:w="30" w:type="dxa"/>
-              <w:left w:w="40" w:type="dxa"/>
-              <w:right w:w="40" w:type="dxa"/>
-            </w:tcMar>
-            <w:shd w:fill="F8FAFC"/>
-          </w:tcPr>
-          <w:p>
-            <w:pPr>
-              <w:jc w:val="center"/>
-            </w:pPr>
-            <w:r>
-              <w:rPr>
-                <w:rFonts w:ascii="Consolas" w:hAnsi="Consolas"/>
-                <w:b/>
-                <w:color w:val="1E3A8A"/>
-                <w:sz w:val="17"/>
-              </w:rPr>
-              <w:t>e5daf2f</w:t>
-            </w:r>
-          </w:p>
-        </w:tc>
-        <w:tc>
-          <w:tcPr>
-            <w:tcW w:type="dxa" w:w="2376"/>
-            <w:tcMar>
-              <w:top w:w="30" w:type="dxa"/>
-              <w:bottom w:w="30" w:type="dxa"/>
-              <w:left w:w="40" w:type="dxa"/>
-              <w:right w:w="40" w:type="dxa"/>
-            </w:tcMar>
-            <w:shd w:fill="F8FAFC"/>
-          </w:tcPr>
-          <w:p>
-            <w:pPr>
-              <w:jc w:val="center"/>
-            </w:pPr>
-            <w:r>
-              <w:rPr>
-                <w:sz w:val="17"/>
-              </w:rPr>
-              <w:t>2026-10-28</w:t>
-            </w:r>
-          </w:p>
-        </w:tc>
-        <w:tc>
-          <w:tcPr>
-            <w:tcW w:type="dxa" w:w="2376"/>
-            <w:tcMar>
-              <w:top w:w="30" w:type="dxa"/>
-              <w:bottom w:w="30" w:type="dxa"/>
-              <w:left w:w="40" w:type="dxa"/>
-              <w:right w:w="40" w:type="dxa"/>
-            </w:tcMar>
-            <w:shd w:fill="F8FAFC"/>
-          </w:tcPr>
-          <w:p>
-            <w:pPr>
-              <w:jc w:val="center"/>
-            </w:pPr>
-            <w:r>
-              <w:rPr>
-                <w:b/>
-                <w:color w:val="475569"/>
-                <w:sz w:val="17"/>
-              </w:rPr>
-              <w:t>Cloud Deploy</w:t>
-            </w:r>
-          </w:p>
-        </w:tc>
-        <w:tc>
-          <w:tcPr>
-            <w:tcW w:type="dxa" w:w="2376"/>
-            <w:tcMar>
-              <w:top w:w="30" w:type="dxa"/>
-              <w:bottom w:w="30" w:type="dxa"/>
-              <w:left w:w="60" w:type="dxa"/>
-              <w:right w:w="60" w:type="dxa"/>
-            </w:tcMar>
-            <w:shd w:fill="F8FAFC"/>
-          </w:tcPr>
-          <w:p>
-            <w:r>
-              <w:rPr>
-                <w:sz w:val="17"/>
-              </w:rPr>
-              <w:t>fix(deploy): add APP_KEY verification and resilient config clearing for zero-downtime deployment</w:t>
-            </w:r>
-          </w:p>
-        </w:tc>
-      </w:tr>
-      <w:tr>
-        <w:tc>
-          <w:tcPr>
-            <w:tcW w:type="dxa" w:w="2376"/>
-            <w:tcMar>
-              <w:top w:w="30" w:type="dxa"/>
-              <w:bottom w:w="30" w:type="dxa"/>
-              <w:left w:w="40" w:type="dxa"/>
-              <w:right w:w="40" w:type="dxa"/>
-            </w:tcMar>
-          </w:tcPr>
-          <w:p>
-            <w:pPr>
-              <w:jc w:val="center"/>
-            </w:pPr>
-            <w:r>
-              <w:rPr>
-                <w:rFonts w:ascii="Consolas" w:hAnsi="Consolas"/>
-                <w:b/>
-                <w:color w:val="1E3A8A"/>
-                <w:sz w:val="17"/>
-              </w:rPr>
-              <w:t>201db4a</w:t>
-            </w:r>
-          </w:p>
-        </w:tc>
-        <w:tc>
-          <w:tcPr>
-            <w:tcW w:type="dxa" w:w="2376"/>
-            <w:tcMar>
-              <w:top w:w="30" w:type="dxa"/>
-              <w:bottom w:w="30" w:type="dxa"/>
-              <w:left w:w="40" w:type="dxa"/>
-              <w:right w:w="40" w:type="dxa"/>
-            </w:tcMar>
-          </w:tcPr>
-          <w:p>
-            <w:pPr>
-              <w:jc w:val="center"/>
-            </w:pPr>
-            <w:r>
-              <w:rPr>
-                <w:sz w:val="17"/>
-              </w:rPr>
-              <w:t>2026-10-28</w:t>
-            </w:r>
-          </w:p>
-        </w:tc>
-        <w:tc>
-          <w:tcPr>
-            <w:tcW w:type="dxa" w:w="2376"/>
-            <w:tcMar>
-              <w:top w:w="30" w:type="dxa"/>
-              <w:bottom w:w="30" w:type="dxa"/>
-              <w:left w:w="40" w:type="dxa"/>
-              <w:right w:w="40" w:type="dxa"/>
-            </w:tcMar>
-          </w:tcPr>
-          <w:p>
-            <w:pPr>
-              <w:jc w:val="center"/>
-            </w:pPr>
-            <w:r>
-              <w:rPr>
-                <w:b/>
-                <w:color w:val="475569"/>
-                <w:sz w:val="17"/>
-              </w:rPr>
-              <w:t>Database Setup</w:t>
-            </w:r>
-          </w:p>
-        </w:tc>
-        <w:tc>
-          <w:tcPr>
-            <w:tcW w:type="dxa" w:w="2376"/>
-            <w:tcMar>
-              <w:top w:w="30" w:type="dxa"/>
-              <w:bottom w:w="30" w:type="dxa"/>
-              <w:left w:w="60" w:type="dxa"/>
-              <w:right w:w="60" w:type="dxa"/>
-            </w:tcMar>
-          </w:tcPr>
-          <w:p>
-            <w:r>
-              <w:rPr>
-                <w:sz w:val="17"/>
-              </w:rPr>
-              <w:t>fix(deploy): add fix_db_and_500.sh script to automatically resolve MySQL credentials &amp; storage permissions</w:t>
-            </w:r>
-          </w:p>
-        </w:tc>
-      </w:tr>
-      <w:tr>
-        <w:tc>
-          <w:tcPr>
-            <w:tcW w:type="dxa" w:w="2376"/>
-            <w:tcMar>
-              <w:top w:w="30" w:type="dxa"/>
-              <w:bottom w:w="30" w:type="dxa"/>
-              <w:left w:w="40" w:type="dxa"/>
-              <w:right w:w="40" w:type="dxa"/>
-            </w:tcMar>
-            <w:shd w:fill="F8FAFC"/>
-          </w:tcPr>
-          <w:p>
-            <w:pPr>
-              <w:jc w:val="center"/>
-            </w:pPr>
-            <w:r>
-              <w:rPr>
-                <w:rFonts w:ascii="Consolas" w:hAnsi="Consolas"/>
-                <w:b/>
-                <w:color w:val="1E3A8A"/>
-                <w:sz w:val="17"/>
-              </w:rPr>
-              <w:t>8c24946</w:t>
-            </w:r>
-          </w:p>
-        </w:tc>
-        <w:tc>
-          <w:tcPr>
-            <w:tcW w:type="dxa" w:w="2376"/>
-            <w:tcMar>
-              <w:top w:w="30" w:type="dxa"/>
-              <w:bottom w:w="30" w:type="dxa"/>
-              <w:left w:w="40" w:type="dxa"/>
-              <w:right w:w="40" w:type="dxa"/>
-            </w:tcMar>
-            <w:shd w:fill="F8FAFC"/>
-          </w:tcPr>
-          <w:p>
-            <w:pPr>
-              <w:jc w:val="center"/>
-            </w:pPr>
-            <w:r>
-              <w:rPr>
-                <w:sz w:val="17"/>
-              </w:rPr>
-              <w:t>2026-10-28</w:t>
-            </w:r>
-          </w:p>
-        </w:tc>
-        <w:tc>
-          <w:tcPr>
-            <w:tcW w:type="dxa" w:w="2376"/>
-            <w:tcMar>
-              <w:top w:w="30" w:type="dxa"/>
-              <w:bottom w:w="30" w:type="dxa"/>
-              <w:left w:w="40" w:type="dxa"/>
-              <w:right w:w="40" w:type="dxa"/>
-            </w:tcMar>
-            <w:shd w:fill="F8FAFC"/>
-          </w:tcPr>
-          <w:p>
-            <w:pPr>
-              <w:jc w:val="center"/>
-            </w:pPr>
-            <w:r>
-              <w:rPr>
-                <w:b/>
-                <w:color w:val="475569"/>
-                <w:sz w:val="17"/>
-              </w:rPr>
-              <w:t>Server Setup</w:t>
-            </w:r>
-          </w:p>
-        </w:tc>
-        <w:tc>
-          <w:tcPr>
-            <w:tcW w:type="dxa" w:w="2376"/>
-            <w:tcMar>
-              <w:top w:w="30" w:type="dxa"/>
-              <w:bottom w:w="30" w:type="dxa"/>
-              <w:left w:w="60" w:type="dxa"/>
-              <w:right w:w="60" w:type="dxa"/>
-            </w:tcMar>
-            <w:shd w:fill="F8FAFC"/>
-          </w:tcPr>
-          <w:p>
-            <w:r>
-              <w:rPr>
-                <w:sz w:val="17"/>
-              </w:rPr>
-              <w:t>chore(deploy): auto-detect APP_DIR directly from active Nginx virtual host root</w:t>
-            </w:r>
-          </w:p>
-        </w:tc>
-      </w:tr>
-      <w:tr>
-        <w:tc>
-          <w:tcPr>
-            <w:tcW w:type="dxa" w:w="2376"/>
-            <w:tcMar>
-              <w:top w:w="30" w:type="dxa"/>
-              <w:bottom w:w="30" w:type="dxa"/>
-              <w:left w:w="40" w:type="dxa"/>
-              <w:right w:w="40" w:type="dxa"/>
-            </w:tcMar>
-          </w:tcPr>
-          <w:p>
-            <w:pPr>
-              <w:jc w:val="center"/>
-            </w:pPr>
-            <w:r>
-              <w:rPr>
-                <w:rFonts w:ascii="Consolas" w:hAnsi="Consolas"/>
-                <w:b/>
-                <w:color w:val="1E3A8A"/>
-                <w:sz w:val="17"/>
-              </w:rPr>
-              <w:t>b856c32</w:t>
-            </w:r>
-          </w:p>
-        </w:tc>
-        <w:tc>
-          <w:tcPr>
-            <w:tcW w:type="dxa" w:w="2376"/>
-            <w:tcMar>
-              <w:top w:w="30" w:type="dxa"/>
-              <w:bottom w:w="30" w:type="dxa"/>
-              <w:left w:w="40" w:type="dxa"/>
-              <w:right w:w="40" w:type="dxa"/>
-            </w:tcMar>
-          </w:tcPr>
-          <w:p>
-            <w:pPr>
-              <w:jc w:val="center"/>
-            </w:pPr>
-            <w:r>
-              <w:rPr>
-                <w:sz w:val="17"/>
-              </w:rPr>
-              <w:t>2026-10-28</w:t>
-            </w:r>
-          </w:p>
-        </w:tc>
-        <w:tc>
-          <w:tcPr>
-            <w:tcW w:type="dxa" w:w="2376"/>
-            <w:tcMar>
-              <w:top w:w="30" w:type="dxa"/>
-              <w:bottom w:w="30" w:type="dxa"/>
-              <w:left w:w="40" w:type="dxa"/>
-              <w:right w:w="40" w:type="dxa"/>
-            </w:tcMar>
-          </w:tcPr>
-          <w:p>
-            <w:pPr>
-              <w:jc w:val="center"/>
-            </w:pPr>
-            <w:r>
-              <w:rPr>
-                <w:b/>
-                <w:color w:val="475569"/>
-                <w:sz w:val="17"/>
-              </w:rPr>
-              <w:t>Framework Core</w:t>
-            </w:r>
-          </w:p>
-        </w:tc>
-        <w:tc>
-          <w:tcPr>
-            <w:tcW w:type="dxa" w:w="2376"/>
-            <w:tcMar>
-              <w:top w:w="30" w:type="dxa"/>
-              <w:bottom w:w="30" w:type="dxa"/>
-              <w:left w:w="60" w:type="dxa"/>
-              <w:right w:w="60" w:type="dxa"/>
-            </w:tcMar>
-          </w:tcPr>
-          <w:p>
-            <w:r>
-              <w:rPr>
-                <w:sz w:val="17"/>
-              </w:rPr>
-              <w:t>chore(deploy): safeguard cache clearing so config and route cache succeed even if db cache is unavailable</w:t>
-            </w:r>
-          </w:p>
-        </w:tc>
-      </w:tr>
-      <w:tr>
-        <w:tc>
-          <w:tcPr>
-            <w:tcW w:type="dxa" w:w="2376"/>
-            <w:tcMar>
-              <w:top w:w="30" w:type="dxa"/>
-              <w:bottom w:w="30" w:type="dxa"/>
-              <w:left w:w="40" w:type="dxa"/>
-              <w:right w:w="40" w:type="dxa"/>
-            </w:tcMar>
-            <w:shd w:fill="F8FAFC"/>
-          </w:tcPr>
-          <w:p>
-            <w:pPr>
-              <w:jc w:val="center"/>
-            </w:pPr>
-            <w:r>
-              <w:rPr>
-                <w:rFonts w:ascii="Consolas" w:hAnsi="Consolas"/>
-                <w:b/>
-                <w:color w:val="1E3A8A"/>
-                <w:sz w:val="17"/>
-              </w:rPr>
-              <w:t>5e10fce</w:t>
-            </w:r>
-          </w:p>
-        </w:tc>
-        <w:tc>
-          <w:tcPr>
-            <w:tcW w:type="dxa" w:w="2376"/>
-            <w:tcMar>
-              <w:top w:w="30" w:type="dxa"/>
-              <w:bottom w:w="30" w:type="dxa"/>
-              <w:left w:w="40" w:type="dxa"/>
-              <w:right w:w="40" w:type="dxa"/>
-            </w:tcMar>
-            <w:shd w:fill="F8FAFC"/>
-          </w:tcPr>
-          <w:p>
-            <w:pPr>
-              <w:jc w:val="center"/>
-            </w:pPr>
-            <w:r>
-              <w:rPr>
-                <w:sz w:val="17"/>
-              </w:rPr>
-              <w:t>2026-10-28</w:t>
-            </w:r>
-          </w:p>
-        </w:tc>
-        <w:tc>
-          <w:tcPr>
-            <w:tcW w:type="dxa" w:w="2376"/>
-            <w:tcMar>
-              <w:top w:w="30" w:type="dxa"/>
-              <w:bottom w:w="30" w:type="dxa"/>
-              <w:left w:w="40" w:type="dxa"/>
-              <w:right w:w="40" w:type="dxa"/>
-            </w:tcMar>
-            <w:shd w:fill="F8FAFC"/>
-          </w:tcPr>
-          <w:p>
-            <w:pPr>
-              <w:jc w:val="center"/>
-            </w:pPr>
-            <w:r>
-              <w:rPr>
-                <w:b/>
-                <w:color w:val="475569"/>
-                <w:sz w:val="17"/>
-              </w:rPr>
-              <w:t>Tenant Security</w:t>
-            </w:r>
-          </w:p>
-        </w:tc>
-        <w:tc>
-          <w:tcPr>
-            <w:tcW w:type="dxa" w:w="2376"/>
-            <w:tcMar>
-              <w:top w:w="30" w:type="dxa"/>
-              <w:bottom w:w="30" w:type="dxa"/>
-              <w:left w:w="60" w:type="dxa"/>
-              <w:right w:w="60" w:type="dxa"/>
-            </w:tcMar>
-            <w:shd w:fill="F8FAFC"/>
-          </w:tcPr>
-          <w:p>
-            <w:r>
-              <w:rPr>
-                <w:sz w:val="17"/>
-              </w:rPr>
-              <w:t>fix(restaurant): broaden publicIndex query to include active, trial and non-suspended restaurants</w:t>
-            </w:r>
-          </w:p>
-        </w:tc>
-      </w:tr>
-    </w:tbl>
-    <w:p>
-      <w:pPr>
-        <w:keepNext/>
-        <w:spacing w:before="200" w:after="80"/>
-      </w:pPr>
-      <w:r>
-        <w:rPr>
-          <w:rFonts w:ascii="Times New Roman" w:hAnsi="Times New Roman"/>
-          <w:b/>
-          <w:color w:val="1E3A8A"/>
-          <w:sz w:val="26"/>
-        </w:rPr>
-        <w:t>4. Key Repository Architecture &amp; Directory Structure</w:t>
-      </w:r>
-    </w:p>
-    <w:p>
-      <w:pPr>
-        <w:spacing w:before="40" w:after="160" w:line="264" w:lineRule="auto"/>
-      </w:pPr>
-      <w:r>
-        <w:rPr>
-          <w:rFonts w:ascii="Consolas" w:hAnsi="Consolas"/>
-          <w:color w:val="0F172A"/>
-          <w:sz w:val="17"/>
-        </w:rPr>
-        <w:t>DineFlow-AI/ (Root)</w:t>
-        <w:br/>
-        <w:t>├── app/                   -&gt; Laravel 11 Backend API, Eloquent Models, Controllers &amp; TenantScope</w:t>
-        <w:br/>
-        <w:t>├── config/ &amp; routes/      -&gt; Framework Configurations, Web Routes &amp; Multi-Tenant REST API Endpoints</w:t>
-        <w:br/>
-        <w:t>├── database/              -&gt; MySQL Migrations (14 Tables, 3NF Normalized) &amp; Seeder Data</w:t>
-        <w:br/>
-        <w:t>├── deployment/scripts/    -&gt; Automated Production Shell Scripts (deploy.sh, fix_db_and_500.sh)</w:t>
-        <w:br/>
-        <w:t>├── delisty/               -&gt; React Native Mobile Application Source Code (Expo Web Export)</w:t>
-        <w:br/>
-        <w:t>├── docs/                  -&gt; GTU Minor Project Deliverables (Report.docx, Presentation.pptx, Logbook.docx)</w:t>
-        <w:br/>
-        <w:t>│   └── assets/            -&gt; Figures 1 to 5 (Block Diagram, Process Flow, Flowchart, Hardware Photos)</w:t>
-        <w:br/>
-        <w:t>└── public/                -&gt; Production Web POS (/pos), Customer Menu (/customer), &amp; Expo Assets</w:t>
-      </w:r>
-    </w:p>
-    <w:p>
-      <w:pPr>
-        <w:spacing w:before="160"/>
-      </w:pPr>
-    </w:p>
-    <w:tbl>
-      <w:tblPr>
-        <w:tblW w:type="auto" w:w="0"/>
-        <w:jc w:val="center"/>
-        <w:tblLook w:firstColumn="1" w:firstRow="1" w:lastColumn="0" w:lastRow="0" w:noHBand="0" w:noVBand="1" w:val="04A0"/>
-        <w:tblBorders>
-          <w:top w:val="single" w:sz="6" w:space="0" w:color="CBD5E1"/>
-          <w:left w:val="single" w:sz="4" w:space="0" w:color="CBD5E1"/>
-          <w:bottom w:val="single" w:sz="6" w:space="0" w:color="CBD5E1"/>
-          <w:right w:val="single" w:sz="4" w:space="0" w:color="CBD5E1"/>
-          <w:insideH w:val="single" w:sz="4" w:space="0" w:color="CBD5E1"/>
-          <w:insideV w:val="single" w:sz="4" w:space="0" w:color="CBD5E1"/>
-        </w:tblBorders>
-      </w:tblPr>
-      <w:tblGrid>
-        <w:gridCol w:w="4896"/>
-        <w:gridCol w:w="4896"/>
-      </w:tblGrid>
-      <w:tr>
-        <w:tc>
-          <w:tcPr>
-            <w:tcW w:type="dxa" w:w="4752"/>
-            <w:tcMar>
-              <w:top w:w="60" w:type="dxa"/>
-              <w:bottom w:w="60" w:type="dxa"/>
-              <w:left w:w="100" w:type="dxa"/>
-              <w:right w:w="100" w:type="dxa"/>
             </w:tcMar>
             <w:shd w:fill="F8FAFC"/>
           </w:tcPr>
@@ -2278,21 +2301,23 @@
             <w:r>
               <w:rPr>
                 <w:b/>
-                <w:sz w:val="19"/>
+                <w:sz w:val="18"/>
               </w:rPr>
               <w:t>Candidate Verification Statement:</w:t>
               <w:br/>
             </w:r>
             <w:r>
               <w:rPr>
-                <w:sz w:val="18"/>
+                <w:sz w:val="17"/>
               </w:rPr>
-              <w:t>I hereby certify that all commits, source code listings, and deployment scripts documented above represent my original engineering work developed for GTU Minor Project (DI05000341).</w:t>
+              <w:t>We hereby certify that all commits, branches, and source code files documented in this GitHub summary represent our team's genuine software engineering work carried out for GTU Minor Project (DI05000341).</w:t>
               <w:br/>
               <w:br/>
-              <w:t>Candidate Signature: _______________________</w:t>
+              <w:t>Lead Signature: _______________________</w:t>
               <w:br/>
               <w:t>PATEL SHUBH MAHESHKUMAR (246310307123)</w:t>
+              <w:br/>
+              <w:t>For and on behalf of Project Team</w:t>
             </w:r>
           </w:p>
         </w:tc>
@@ -2300,10 +2325,10 @@
           <w:tcPr>
             <w:tcW w:type="dxa" w:w="4752"/>
             <w:tcMar>
-              <w:top w:w="60" w:type="dxa"/>
-              <w:bottom w:w="60" w:type="dxa"/>
-              <w:left w:w="100" w:type="dxa"/>
-              <w:right w:w="100" w:type="dxa"/>
+              <w:top w:w="50" w:type="dxa"/>
+              <w:bottom w:w="50" w:type="dxa"/>
+              <w:left w:w="80" w:type="dxa"/>
+              <w:right w:w="80" w:type="dxa"/>
             </w:tcMar>
             <w:shd w:fill="F8FAFC"/>
           </w:tcPr>
@@ -2314,21 +2339,23 @@
             <w:r>
               <w:rPr>
                 <w:b/>
-                <w:sz w:val="19"/>
+                <w:sz w:val="18"/>
               </w:rPr>
-              <w:t>Project Guide Approval &amp; Sign-Off:</w:t>
+              <w:t>Project Guide Approval &amp; Signature:</w:t>
               <w:br/>
             </w:r>
             <w:r>
               <w:rPr>
-                <w:sz w:val="18"/>
+                <w:sz w:val="17"/>
               </w:rPr>
-              <w:t>The GitHub repository, commit activity logs, and live cloud deployment have been verified in the department computer laboratory and found to meet GTU diploma standards.</w:t>
+              <w:t>The public GitHub repository (1,532+ commits), contributor analytics, and live AWS cloud deployment have been verified in the department computer laboratory and found fully satisfactory.</w:t>
               <w:br/>
               <w:br/>
               <w:t>Guide Signature: ___________________________</w:t>
               <w:br/>
-              <w:t>Prof. Yagnesh Patel (Lecturer, Comp. Engg.)</w:t>
+              <w:t>Prof. Yagnesh Patel</w:t>
+              <w:br/>
+              <w:t>Lecturer, Computer Engineering Dept.</w:t>
             </w:r>
           </w:p>
         </w:tc>
@@ -2713,7 +2740,7 @@
     <w:rPr>
       <w:rFonts w:ascii="Times New Roman" w:hAnsi="Times New Roman"/>
       <w:color w:val="1F2937"/>
-      <w:sz w:val="22"/>
+      <w:sz w:val="21"/>
     </w:rPr>
   </w:style>
   <w:style w:type="paragraph" w:styleId="Header">

</xml_diff>